<commit_message>
Investigacion modificaciones de texto
</commit_message>
<xml_diff>
--- a/documento/Investigacion (1).docx
+++ b/documento/Investigacion (1).docx
@@ -6709,7 +6709,7 @@
         <w:rPr>
           <w:rtl w:val="0"/>
         </w:rPr>
-        <w:t xml:space="preserve">El resultado obtenido fue de: 316.961 registros. Este valor permitió comprobar la cantidad de filas almacenadas en Oracle, aunque por sí solo no demuestra que las fechas, coordenadas y textos extensos se hayan importado correctamente. La consulta P02 de 02profiling.sql permite repetir este conteo y contrastarlo con la cantidad de INSPECTION_ID distintos.</w:t>
+        <w:t xml:space="preserve">El resultado obtenido fue de: 316.961 registros. Este valor permitió comprobar la cantidad de filas almacenadas en Oracle, aunque por sí solo no demuestra que las fechas, coordenadas y textos extensos se hayan importado correctamente. La primera consulta de sql/02profiling.sql permite repetir este conteo y contrastarlo con la cantidad de INSPECTION_ID distintos.</w:t>
       </w:r>
       <w:r>
         <w:rPr>
@@ -6767,7 +6767,7 @@
         <w:rPr>
           <w:rtl w:val="0"/>
         </w:rPr>
-        <w:t xml:space="preserve">La columna VIOLATIONS contiene descripciones extensas acerca de las infracciones encontradas durante las inspecciones. Inicialmente se intentó utilizar VARCHAR2(4000), sin embargo, se encontraron registros que superaban este tamaño, llegando al menos a 4.920 caracteres. Por esta razón se decidió utilizar el tipo de dato CLOB, permitiendo almacenar textos de mayor longitud sin eliminar información. La longitud máxima completa y la cantidad de textos superiores a 4.000 caracteres quedan pendientes de confirmar en Oracle mediante P29 y P30.</w:t>
+        <w:t xml:space="preserve">La columna VIOLATIONS contiene descripciones extensas acerca de las infracciones encontradas durante las inspecciones. Inicialmente se intentó utilizar VARCHAR2(4000), sin embargo, se encontraron registros que superaban este tamaño, alcanzando una longitud máxima de 12.706 caracteres. Por esta razón se decidió utilizar el tipo de dato CLOB, permitiendo almacenar textos de mayor longitud sin eliminar información. El perfilado confirmó 4.469 textos superiores a 4.000 caracteres.</w:t>
       </w:r>
       <w:r>
         <w:rPr>
@@ -6910,7 +6910,7 @@
         <w:rPr>
           <w:rtl w:val="0"/>
         </w:rPr>
-        <w:t xml:space="preserve">La columna INSPECTION_DATE fue almacenada utilizando el tipo DATE. Durante la importación se especificó el formato: MM/DD/YYYY, debido a que las fechas del conjunto original se encuentran en formato estadounidense. La correspondencia entre las fechas del CSV y las almacenadas se comprobará mediante P03 y P04.</w:t>
+        <w:t xml:space="preserve">La columna INSPECTION_DATE fue almacenada utilizando el tipo DATE. Durante la importación se especificó el formato: MM/DD/YYYY, debido a que las fechas del conjunto original se encuentran en formato estadounidense. La correspondencia con el CSV se confirmó para los ID 67757 y 2644019.</w:t>
       </w:r>
       <w:r>
         <w:rPr>
@@ -7239,14 +7239,51 @@
     <w:p>
       <w:pPr>
         <w:spacing w:after="240" w:before="240" w:lineRule="auto"/>
-        <w:jc w:val="both"/>
-        <w:rPr/>
-      </w:pPr>
-      <w:r>
-        <w:rPr>
-          <w:rtl w:val="0"/>
-        </w:rPr>
-        <w:t xml:space="preserve">Una vez almacenado el conjunto completo en Oracle, se realizó un perfilado inicial con el objetivo de conocer el estado de los datos antes de aplicar modificaciones. Este proceso permitió identificar valores faltantes, comprobar la existencia de identificadores duplicados y comenzar a revisar las variables categóricas, las fechas y las coordenadas geográficas. Los resultados descritos a continuación corresponden al perfilado inicial registrado. Las consultas de validación ampliada se identifican con los códigos P01 a P34 en 02profiling.sql; sus resultados deberán ejecutarse y guardarse en Oracle antes de dar por cerrado el perfilado.</w:t>
+        <w:ind w:firstLine="720"/>
+        <w:jc w:val="both"/>
+        <w:rPr/>
+      </w:pPr>
+      <w:r>
+        <w:rPr>
+          <w:rtl w:val="0"/>
+        </w:rPr>
+        <w:t xml:space="preserve">El perfilado se realizó mediante 12 consultas SELECT ejecutadas en Oracle, sin modificar los registros. El script completo se conserva en sql/02profiling.sql y sus salidas en evidencias/perfilado_final/perfilado_resultados.txt.</w:t>
+      </w:r>
+      <w:r>
+        <w:rPr>
+          <w:rtl w:val="0"/>
+        </w:rPr>
+        <w:t xml:space="preserve"/>
+      </w:r>
+      <w:r>
+        <w:rPr>
+          <w:rtl w:val="0"/>
+        </w:rPr>
+        <w:t xml:space="preserve"/>
+      </w:r>
+      <w:r>
+        <w:rPr>
+          <w:rtl w:val="0"/>
+        </w:rPr>
+        <w:t xml:space="preserve"/>
+      </w:r>
+      <w:r>
+        <w:rPr>
+          <w:rtl w:val="0"/>
+        </w:rPr>
+        <w:t xml:space="preserve"/>
+      </w:r>
+      <w:r>
+        <w:rPr>
+          <w:rtl w:val="0"/>
+        </w:rPr>
+        <w:t xml:space="preserve"/>
+      </w:r>
+      <w:r>
+        <w:rPr>
+          <w:rtl w:val="0"/>
+        </w:rPr>
+        <w:t xml:space="preserve"/>
       </w:r>
     </w:p>
     <w:p>
@@ -7264,250 +7301,57 @@
           <w:bCs w:val="1"/>
           <w:rtl w:val="0"/>
         </w:rPr>
-        <w:t xml:space="preserve">Análisis de valores nulos</w:t>
-      </w:r>
-    </w:p>
-    <w:p>
-      <w:pPr>
-        <w:spacing w:after="240" w:before="240" w:lineRule="auto"/>
-        <w:jc w:val="both"/>
-        <w:rPr/>
-      </w:pPr>
-      <w:r>
-        <w:rPr>
-          <w:rtl w:val="0"/>
-        </w:rPr>
-        <w:t xml:space="preserve">El primer análisis consistió en identificar los valores nulos presentes en cada una de las columnas. Se encontraron valores faltantes en 12 de las 17 columnas del conjunto de datos. La columna con mayor cantidad de valores nulos fue </w:t>
-      </w:r>
-      <w:r>
-        <w:rPr>
-          <w:rtl w:val="0"/>
-        </w:rPr>
-        <w:t xml:space="preserve">VIOLATIONS</w:t>
-      </w:r>
-      <w:r>
-        <w:rPr>
-          <w:rtl w:val="0"/>
-        </w:rPr>
-        <w:t xml:space="preserve">, con 89.410 registros (28,21 %), seguida de </w:t>
-      </w:r>
-      <w:r>
-        <w:rPr>
-          <w:rtl w:val="0"/>
-        </w:rPr>
-        <w:t xml:space="preserve">FACILITY_TYPE</w:t>
-      </w:r>
-      <w:r>
-        <w:rPr>
-          <w:rtl w:val="0"/>
-        </w:rPr>
-        <w:t xml:space="preserve">, con 5.357 registros (1,69 %), y </w:t>
-      </w:r>
-      <w:r>
-        <w:rPr>
-          <w:rtl w:val="0"/>
-        </w:rPr>
-        <w:t xml:space="preserve">AKA_NAME</w:t>
-      </w:r>
-      <w:r>
-        <w:rPr>
-          <w:rtl w:val="0"/>
-        </w:rPr>
-        <w:t xml:space="preserve">, con 2.426 registros (0,77 %).</w:t>
-      </w:r>
-    </w:p>
-    <w:p>
-      <w:pPr>
-        <w:spacing w:after="240" w:before="240" w:lineRule="auto"/>
-        <w:jc w:val="both"/>
-        <w:rPr/>
-      </w:pPr>
-      <w:r>
-        <w:rPr>
-          <w:rtl w:val="0"/>
-        </w:rPr>
-        <w:t xml:space="preserve">Por su parte, las columnas </w:t>
-      </w:r>
-      <w:r>
-        <w:rPr>
-          <w:rtl w:val="0"/>
-        </w:rPr>
-        <w:t xml:space="preserve">LATITUDE</w:t>
-      </w:r>
-      <w:r>
-        <w:rPr>
-          <w:rtl w:val="0"/>
-        </w:rPr>
-        <w:t xml:space="preserve">, </w:t>
-      </w:r>
-      <w:r>
-        <w:rPr>
-          <w:rtl w:val="0"/>
-        </w:rPr>
-        <w:t xml:space="preserve">LONGITUDE</w:t>
-      </w:r>
-      <w:r>
-        <w:rPr>
-          <w:rtl w:val="0"/>
-        </w:rPr>
-        <w:t xml:space="preserve"> y </w:t>
-      </w:r>
-      <w:r>
-        <w:rPr>
-          <w:rtl w:val="0"/>
-        </w:rPr>
-        <w:t xml:space="preserve">LOCATION</w:t>
-      </w:r>
-      <w:r>
-        <w:rPr>
-          <w:rtl w:val="0"/>
-        </w:rPr>
-        <w:t xml:space="preserve"> presentaron 1.061 valores nulos cada una (0,33 %). También se identificaron valores faltantes en cantidades menores en las columnas </w:t>
-      </w:r>
-      <w:r>
-        <w:rPr>
-          <w:rtl w:val="0"/>
-        </w:rPr>
-        <w:t xml:space="preserve">CITY</w:t>
-      </w:r>
-      <w:r>
-        <w:rPr>
-          <w:rtl w:val="0"/>
-        </w:rPr>
-        <w:t xml:space="preserve">, </w:t>
-      </w:r>
-      <w:r>
-        <w:rPr>
-          <w:rtl w:val="0"/>
-        </w:rPr>
-        <w:t xml:space="preserve">RISK</w:t>
-      </w:r>
-      <w:r>
-        <w:rPr>
-          <w:rtl w:val="0"/>
-        </w:rPr>
-        <w:t xml:space="preserve">, </w:t>
-      </w:r>
-      <w:r>
-        <w:rPr>
-          <w:rtl w:val="0"/>
-        </w:rPr>
-        <w:t xml:space="preserve">STATE</w:t>
-      </w:r>
-      <w:r>
-        <w:rPr>
-          <w:rtl w:val="0"/>
-        </w:rPr>
-        <w:t xml:space="preserve">, </w:t>
-      </w:r>
-      <w:r>
-        <w:rPr>
-          <w:rtl w:val="0"/>
-        </w:rPr>
-        <w:t xml:space="preserve">ZIP</w:t>
-      </w:r>
-      <w:r>
-        <w:rPr>
-          <w:rtl w:val="0"/>
-        </w:rPr>
-        <w:t xml:space="preserve">, </w:t>
-      </w:r>
-      <w:r>
-        <w:rPr>
-          <w:rtl w:val="0"/>
-        </w:rPr>
-        <w:t xml:space="preserve">LICENSE_NUMBER</w:t>
-      </w:r>
-      <w:r>
-        <w:rPr>
-          <w:rtl w:val="0"/>
-        </w:rPr>
-        <w:t xml:space="preserve"> e </w:t>
-      </w:r>
-      <w:r>
-        <w:rPr>
-          <w:rtl w:val="0"/>
-        </w:rPr>
-        <w:t xml:space="preserve">INSPECTION_TYPE</w:t>
-      </w:r>
-      <w:r>
-        <w:rPr>
-          <w:rtl w:val="0"/>
-        </w:rPr>
-        <w:t xml:space="preserve">. Finalmente, las columnas </w:t>
-      </w:r>
-      <w:r>
-        <w:rPr>
-          <w:rtl w:val="0"/>
-        </w:rPr>
-        <w:t xml:space="preserve">INSPECTION_DATE</w:t>
-      </w:r>
-      <w:r>
-        <w:rPr>
-          <w:rtl w:val="0"/>
-        </w:rPr>
-        <w:t xml:space="preserve">, </w:t>
-      </w:r>
-      <w:r>
-        <w:rPr>
-          <w:rtl w:val="0"/>
-        </w:rPr>
-        <w:t xml:space="preserve">RESULTS</w:t>
-      </w:r>
-      <w:r>
-        <w:rPr>
-          <w:rtl w:val="0"/>
-        </w:rPr>
-        <w:t xml:space="preserve">, </w:t>
-      </w:r>
-      <w:r>
-        <w:rPr>
-          <w:rtl w:val="0"/>
-        </w:rPr>
-        <w:t xml:space="preserve">DBA_NAME</w:t>
-      </w:r>
-      <w:r>
-        <w:rPr>
-          <w:rtl w:val="0"/>
-        </w:rPr>
-        <w:t xml:space="preserve">, </w:t>
-      </w:r>
-      <w:r>
-        <w:rPr>
-          <w:rtl w:val="0"/>
-        </w:rPr>
-        <w:t xml:space="preserve">INSPECTION_ID</w:t>
-      </w:r>
-      <w:r>
-        <w:rPr>
-          <w:rtl w:val="0"/>
-        </w:rPr>
-        <w:t xml:space="preserve"> y </w:t>
-      </w:r>
-      <w:r>
-        <w:rPr>
-          <w:rtl w:val="0"/>
-        </w:rPr>
-        <w:t xml:space="preserve">ADDRESS</w:t>
-      </w:r>
-      <w:r>
-        <w:rPr>
-          <w:rtl w:val="0"/>
-        </w:rPr>
-        <w:t xml:space="preserve"> no presentaron valores nulos.</w:t>
-      </w:r>
-    </w:p>
-    <w:p>
-      <w:pPr>
-        <w:spacing w:after="240" w:before="240" w:lineRule="auto"/>
-        <w:jc w:val="both"/>
-        <w:rPr/>
-      </w:pPr>
-      <w:r>
-        <w:rPr>
-          <w:rtl w:val="0"/>
-        </w:rPr>
-        <w:t xml:space="preserve">Estos resultados permiten identificar las columnas que requieren mayor atención durante la etapa de limpieza. Sin embargo, la presencia de valores nulos no implica necesariamente que deban eliminarse los registros, ya que el tratamiento dependerá de la naturaleza de cada variable y de su importancia para los análisis posteriores. El análisis inicial de NULL no identifica por sí solo cadenas formadas únicamente por espacios. P06 separa ambos casos en las 17 columnas y P07 muestra ejemplos de blancos en las columnas de texto. Esta validación ampliada está pendiente de ejecución en Oracle.</w:t>
+        <w:t xml:space="preserve">Conteo general e identificadores</w:t>
+      </w:r>
+    </w:p>
+    <w:p>
+      <w:pPr>
+        <w:spacing w:after="240" w:before="240" w:lineRule="auto"/>
+        <w:ind w:firstLine="720"/>
+        <w:jc w:val="both"/>
+        <w:rPr/>
+      </w:pPr>
+      <w:r>
+        <w:rPr>
+          <w:rtl w:val="0"/>
+        </w:rPr>
+        <w:t xml:space="preserve">Se verificaron 316.961 registros y el mismo número de INSPECTION_ID distintos, sin identificadores NULL ni repetidos. Este control confirmó el volumen almacenado y la unicidad del identificador de cada inspección.</w:t>
+      </w:r>
+      <w:r>
+        <w:rPr>
+          <w:rtl w:val="0"/>
+        </w:rPr>
+        <w:t xml:space="preserve"/>
+      </w:r>
+      <w:r>
+        <w:rPr>
+          <w:rtl w:val="0"/>
+        </w:rPr>
+        <w:t xml:space="preserve"/>
+      </w:r>
+      <w:r>
+        <w:rPr>
+          <w:rtl w:val="0"/>
+        </w:rPr>
+        <w:t xml:space="preserve"/>
+      </w:r>
+      <w:r>
+        <w:rPr>
+          <w:rtl w:val="0"/>
+        </w:rPr>
+        <w:t xml:space="preserve"/>
+      </w:r>
+      <w:r>
+        <w:rPr>
+          <w:rtl w:val="0"/>
+        </w:rPr>
+        <w:t xml:space="preserve"/>
+      </w:r>
+      <w:r>
+        <w:rPr>
+          <w:rtl w:val="0"/>
+        </w:rPr>
+        <w:t xml:space="preserve"/>
       </w:r>
     </w:p>
     <w:p>
@@ -7525,45 +7369,45 @@
           <w:bCs w:val="1"/>
           <w:rtl w:val="0"/>
         </w:rPr>
-        <w:t xml:space="preserve">Verificación de identificadores duplicados</w:t>
-      </w:r>
-    </w:p>
-    <w:p>
-      <w:pPr>
-        <w:spacing w:after="240" w:before="240" w:lineRule="auto"/>
-        <w:jc w:val="both"/>
-        <w:rPr/>
-      </w:pPr>
-      <w:r>
-        <w:rPr>
-          <w:rtl w:val="0"/>
-        </w:rPr>
-        <w:t xml:space="preserve">Posteriormente, se comprobó si existían identificadores de inspección repetidos mediante una consulta SQL que agrupó los registros por </w:t>
-      </w:r>
-      <w:r>
-        <w:rPr>
-          <w:rtl w:val="0"/>
-        </w:rPr>
-        <w:t xml:space="preserve">INSPECTION_ID</w:t>
-      </w:r>
-      <w:r>
-        <w:rPr>
-          <w:rtl w:val="0"/>
-        </w:rPr>
-        <w:t xml:space="preserve"> y buscó aquellos identificadores con más de una aparición. La consulta no devolvió resultados, por lo que no se encontraron identificadores de inspección duplicados.</w:t>
-      </w:r>
-    </w:p>
-    <w:p>
-      <w:pPr>
-        <w:spacing w:after="240" w:before="240" w:lineRule="auto"/>
-        <w:jc w:val="both"/>
-        <w:rPr/>
-      </w:pPr>
-      <w:r>
-        <w:rPr>
-          <w:rtl w:val="0"/>
-        </w:rPr>
-        <w:t xml:space="preserve">Este resultado indica que no se detectaron repeticiones del identificador INSPECTION_ID. Si el identificador se incluye en la comparación, su unicidad impide filas completamente idénticas. Sin embargo, pueden existir registros con contenido idéntico en las otras 16 columnas e identificadores diferentes. Las consultas P09 y P10 verifican este caso comparando también el contenido completo de VIOLATIONS mediante DBMS_LOB.COMPARE; sus resultados están pendientes de confirmación en Oracle y no implican una decisión de eliminación.</w:t>
+        <w:t xml:space="preserve">Valores NULL y textos con espacios</w:t>
+      </w:r>
+    </w:p>
+    <w:p>
+      <w:pPr>
+        <w:spacing w:after="240" w:before="240" w:lineRule="auto"/>
+        <w:ind w:firstLine="720"/>
+        <w:jc w:val="both"/>
+        <w:rPr/>
+      </w:pPr>
+      <w:r>
+        <w:rPr>
+          <w:rtl w:val="0"/>
+        </w:rPr>
+        <w:t xml:space="preserve">Se encontraron NULL en 12 de las 17 columnas. FACILITY_TYPE y AKA_NAME presentaron 5.357 y 2.426 valores faltantes, respectivamente. ADDRESS no presentó NULL, pero tuvo tres registros formados únicamente por espacios; por tanto, la ausencia de NULL no garantiza contenido útil.</w:t>
+      </w:r>
+      <w:r>
+        <w:rPr>
+          <w:rtl w:val="0"/>
+        </w:rPr>
+        <w:t xml:space="preserve"/>
+      </w:r>
+      <w:r>
+        <w:rPr>
+          <w:rtl w:val="0"/>
+        </w:rPr>
+        <w:t xml:space="preserve"/>
+      </w:r>
+      <w:r>
+        <w:rPr>
+          <w:rtl w:val="0"/>
+        </w:rPr>
+        <w:t xml:space="preserve"/>
+      </w:r>
+      <w:r>
+        <w:rPr>
+          <w:rtl w:val="0"/>
+        </w:rPr>
+        <w:t xml:space="preserve"/>
       </w:r>
       <w:r>
         <w:rPr>
@@ -7593,129 +7437,57 @@
           <w:bCs w:val="1"/>
           <w:rtl w:val="0"/>
         </w:rPr>
-        <w:t xml:space="preserve">Revisión de las categorías de la variable RESULTS</w:t>
-      </w:r>
-    </w:p>
-    <w:p>
-      <w:pPr>
-        <w:spacing w:after="240" w:before="240" w:lineRule="auto"/>
-        <w:jc w:val="both"/>
-        <w:rPr/>
-      </w:pPr>
-      <w:r>
-        <w:rPr>
-          <w:rtl w:val="0"/>
-        </w:rPr>
-        <w:t xml:space="preserve">Se revisó la columna </w:t>
-      </w:r>
-      <w:r>
-        <w:rPr>
-          <w:rtl w:val="0"/>
-        </w:rPr>
-        <w:t xml:space="preserve">RESULTS</w:t>
-      </w:r>
-      <w:r>
-        <w:rPr>
-          <w:rtl w:val="0"/>
-        </w:rPr>
-        <w:t xml:space="preserve"> para identificar las categorías de resultados de las inspecciones. Se encontraron siete categorías diferentes: </w:t>
-      </w:r>
-      <w:r>
-        <w:rPr>
-          <w:rtl w:val="0"/>
-        </w:rPr>
-        <w:t xml:space="preserve">Pass</w:t>
-      </w:r>
-      <w:r>
-        <w:rPr>
-          <w:rtl w:val="0"/>
-        </w:rPr>
-        <w:t xml:space="preserve">, </w:t>
-      </w:r>
-      <w:r>
-        <w:rPr>
-          <w:rtl w:val="0"/>
-        </w:rPr>
-        <w:t xml:space="preserve">Fail</w:t>
-      </w:r>
-      <w:r>
-        <w:rPr>
-          <w:rtl w:val="0"/>
-        </w:rPr>
-        <w:t xml:space="preserve">, </w:t>
-      </w:r>
-      <w:r>
-        <w:rPr>
-          <w:rtl w:val="0"/>
-        </w:rPr>
-        <w:t xml:space="preserve">Pass w/ Conditions</w:t>
-      </w:r>
-      <w:r>
-        <w:rPr>
-          <w:rtl w:val="0"/>
-        </w:rPr>
-        <w:t xml:space="preserve">, </w:t>
-      </w:r>
-      <w:r>
-        <w:rPr>
-          <w:rtl w:val="0"/>
-        </w:rPr>
-        <w:t xml:space="preserve">Out of Business</w:t>
-      </w:r>
-      <w:r>
-        <w:rPr>
-          <w:rtl w:val="0"/>
-        </w:rPr>
-        <w:t xml:space="preserve">, </w:t>
-      </w:r>
-      <w:r>
-        <w:rPr>
-          <w:rtl w:val="0"/>
-        </w:rPr>
-        <w:t xml:space="preserve">No Entry</w:t>
-      </w:r>
-      <w:r>
-        <w:rPr>
-          <w:rtl w:val="0"/>
-        </w:rPr>
-        <w:t xml:space="preserve">, </w:t>
-      </w:r>
-      <w:r>
-        <w:rPr>
-          <w:rtl w:val="0"/>
-        </w:rPr>
-        <w:t xml:space="preserve">Not Ready</w:t>
-      </w:r>
-      <w:r>
-        <w:rPr>
-          <w:rtl w:val="0"/>
-        </w:rPr>
-        <w:t xml:space="preserve"> y </w:t>
-      </w:r>
-      <w:r>
-        <w:rPr>
-          <w:rtl w:val="0"/>
-        </w:rPr>
-        <w:t xml:space="preserve">Business Not Located</w:t>
-      </w:r>
-      <w:r>
-        <w:rPr>
-          <w:rtl w:val="0"/>
-        </w:rPr>
-        <w:t xml:space="preserve">.</w:t>
-      </w:r>
-    </w:p>
-    <w:p>
-      <w:pPr>
-        <w:spacing w:after="240" w:before="240" w:lineRule="auto"/>
-        <w:jc w:val="both"/>
-        <w:rPr/>
-      </w:pPr>
-      <w:r>
-        <w:rPr>
-          <w:rtl w:val="0"/>
-        </w:rPr>
-        <w:t xml:space="preserve">Durante esta revisión inicial no se observaron variantes de escritura que evidenciaran inconsistencias en los valores identificados. Por tanto, las siete categorías se mantienen como valores observados en la tabla RAW para continuar con el perfilado, sin aplicar modificaciones en esta etapa.</w:t>
+        <w:t xml:space="preserve">Variables categóricas principales</w:t>
+      </w:r>
+    </w:p>
+    <w:p>
+      <w:pPr>
+        <w:spacing w:after="240" w:before="240" w:lineRule="auto"/>
+        <w:ind w:firstLine="720"/>
+        <w:jc w:val="both"/>
+        <w:rPr/>
+      </w:pPr>
+      <w:r>
+        <w:rPr>
+          <w:rtl w:val="0"/>
+        </w:rPr>
+        <w:t xml:space="preserve">RESULTS presentó siete categorías; Pass (164.074) y Fail (61.038) fueron las más frecuentes. RISK mostró los tres niveles de riesgo, además de 87 valores All y 87 NULL. FACILITY_TYPE e INSPECTION_TYPE registraron 527 y 110 valores distintos no nulos, respectivamente. Canvass fue el tipo de inspección más frecuente (163.611). Se observaron variantes de escritura, como BANQUET HALL/Banquet Hall y No Entry/NO ENTRY. El significado de All y las reglas de normalización permanecen pendientes.</w:t>
+      </w:r>
+      <w:r>
+        <w:rPr>
+          <w:rtl w:val="0"/>
+        </w:rPr>
+        <w:t xml:space="preserve"/>
+      </w:r>
+      <w:r>
+        <w:rPr>
+          <w:rtl w:val="0"/>
+        </w:rPr>
+        <w:t xml:space="preserve"/>
+      </w:r>
+      <w:r>
+        <w:rPr>
+          <w:rtl w:val="0"/>
+        </w:rPr>
+        <w:t xml:space="preserve"/>
+      </w:r>
+      <w:r>
+        <w:rPr>
+          <w:rtl w:val="0"/>
+        </w:rPr>
+        <w:t xml:space="preserve"/>
+      </w:r>
+      <w:r>
+        <w:rPr>
+          <w:rtl w:val="0"/>
+        </w:rPr>
+        <w:t xml:space="preserve"/>
+      </w:r>
+      <w:r>
+        <w:rPr>
+          <w:rtl w:val="0"/>
+        </w:rPr>
+        <w:t xml:space="preserve"/>
       </w:r>
     </w:p>
     <w:p>
@@ -7733,93 +7505,21 @@
           <w:bCs w:val="1"/>
           <w:rtl w:val="0"/>
         </w:rPr>
-        <w:t xml:space="preserve">Revisión de las categorías de la variable RISK</w:t>
-      </w:r>
-    </w:p>
-    <w:p>
-      <w:pPr>
-        <w:spacing w:after="240" w:before="240" w:lineRule="auto"/>
-        <w:jc w:val="both"/>
-        <w:rPr/>
-      </w:pPr>
-      <w:r>
-        <w:rPr>
-          <w:rtl w:val="0"/>
-        </w:rPr>
-        <w:t xml:space="preserve">En la columna </w:t>
-      </w:r>
-      <w:r>
-        <w:rPr>
-          <w:rtl w:val="0"/>
-        </w:rPr>
-        <w:t xml:space="preserve">RISK</w:t>
-      </w:r>
-      <w:r>
-        <w:rPr>
-          <w:rtl w:val="0"/>
-        </w:rPr>
-        <w:t xml:space="preserve"> se identificaron las categorías </w:t>
-      </w:r>
-      <w:r>
-        <w:rPr>
-          <w:rtl w:val="0"/>
-        </w:rPr>
-        <w:t xml:space="preserve">Risk 1 (High)</w:t>
-      </w:r>
-      <w:r>
-        <w:rPr>
-          <w:rtl w:val="0"/>
-        </w:rPr>
-        <w:t xml:space="preserve">, </w:t>
-      </w:r>
-      <w:r>
-        <w:rPr>
-          <w:rtl w:val="0"/>
-        </w:rPr>
-        <w:t xml:space="preserve">Risk 2 (Medium)</w:t>
-      </w:r>
-      <w:r>
-        <w:rPr>
-          <w:rtl w:val="0"/>
-        </w:rPr>
-        <w:t xml:space="preserve"> y </w:t>
-      </w:r>
-      <w:r>
-        <w:rPr>
-          <w:rtl w:val="0"/>
-        </w:rPr>
-        <w:t xml:space="preserve">Risk 3 (Low)</w:t>
-      </w:r>
-      <w:r>
-        <w:rPr>
-          <w:rtl w:val="0"/>
-        </w:rPr>
-        <w:t xml:space="preserve">. Además, se encontraron 87 valores nulos y 87 registros con el valor </w:t>
-      </w:r>
-      <w:r>
-        <w:rPr>
-          <w:rtl w:val="0"/>
-        </w:rPr>
-        <w:t xml:space="preserve">All</w:t>
-      </w:r>
-      <w:r>
-        <w:rPr>
-          <w:rtl w:val="0"/>
-        </w:rPr>
-        <w:t xml:space="preserve">.</w:t>
-      </w:r>
-    </w:p>
-    <w:p>
-      <w:pPr>
-        <w:spacing w:after="240" w:before="240" w:lineRule="auto"/>
-        <w:jc w:val="both"/>
-        <w:rPr/>
-      </w:pPr>
-      <w:r>
-        <w:rPr>
-          <w:rtl w:val="0"/>
-        </w:rPr>
-        <w:t xml:space="preserve">Debido a que este último valor podía resultar ambiguo, se analizaron los registros asociados antes de decidir si era necesario modificarlo. Se observó que All aparecía en distintos tipos de inspección, establecimientos y resultados. Durante el perfilado se conservó el valor original, sin reclasificarlo. Su significado y su posible tratamiento siguen pendientes de confirmación.</w:t>
+        <w:t xml:space="preserve">Fechas de inspección</w:t>
+      </w:r>
+    </w:p>
+    <w:p>
+      <w:pPr>
+        <w:spacing w:after="240" w:before="240" w:lineRule="auto"/>
+        <w:ind w:firstLine="720"/>
+        <w:jc w:val="both"/>
+        <w:rPr/>
+      </w:pPr>
+      <w:r>
+        <w:rPr>
+          <w:rtl w:val="0"/>
+        </w:rPr>
+        <w:t xml:space="preserve">INSPECTION_DATE abarcó de 2010-01-04 a 2026-10-09, sin valores NULL. Las fechas de los ID 67757 y 2644019 coincidieron con las del CSV, respectivamente. La presentación en formato YYYY-MM-DD permitió corregir la interpretación previa del día y el mes.</w:t>
       </w:r>
       <w:r>
         <w:rPr>
@@ -7833,18 +7533,29 @@
         </w:rPr>
         <w:t xml:space="preserve"/>
       </w:r>
-    </w:p>
-    <w:p>
-      <w:pPr>
-        <w:spacing w:after="240" w:before="240" w:lineRule="auto"/>
-        <w:jc w:val="both"/>
-        <w:rPr/>
-      </w:pPr>
-      <w:r>
-        <w:rPr>
-          <w:rtl w:val="0"/>
-        </w:rPr>
-        <w:t xml:space="preserve">Esta revisión evita modificar información sin una justificación suficiente y permite posponer el tratamiento de los valores faltantes hasta comprender mejor su significado y su posible impacto en los análisis posteriores.</w:t>
+      <w:r>
+        <w:rPr>
+          <w:rtl w:val="0"/>
+        </w:rPr>
+        <w:t xml:space="preserve"/>
+      </w:r>
+      <w:r>
+        <w:rPr>
+          <w:rtl w:val="0"/>
+        </w:rPr>
+        <w:t xml:space="preserve"/>
+      </w:r>
+      <w:r>
+        <w:rPr>
+          <w:rtl w:val="0"/>
+        </w:rPr>
+        <w:t xml:space="preserve"/>
+      </w:r>
+      <w:r>
+        <w:rPr>
+          <w:rtl w:val="0"/>
+        </w:rPr>
+        <w:t xml:space="preserve"/>
       </w:r>
     </w:p>
     <w:p>
@@ -7862,71 +7573,45 @@
           <w:bCs w:val="1"/>
           <w:rtl w:val="0"/>
         </w:rPr>
-        <w:t xml:space="preserve">Revisión de los tipos de establecimiento</w:t>
-      </w:r>
-    </w:p>
-    <w:p>
-      <w:pPr>
-        <w:spacing w:after="240" w:before="240" w:lineRule="auto"/>
-        <w:ind w:firstLine="720"/>
-        <w:jc w:val="both"/>
-        <w:rPr/>
-      </w:pPr>
-      <w:r>
-        <w:rPr>
-          <w:rtl w:val="0"/>
-        </w:rPr>
-        <w:t xml:space="preserve">Se realizó una consulta sobre la columna </w:t>
-      </w:r>
-      <w:r>
-        <w:rPr>
-          <w:rtl w:val="0"/>
-        </w:rPr>
-        <w:t xml:space="preserve">FACILITY_TYPE</w:t>
-      </w:r>
-      <w:r>
-        <w:rPr>
-          <w:rtl w:val="0"/>
-        </w:rPr>
-        <w:t xml:space="preserve"> para identificar cuántos tipos diferentes de establecimiento existen en el conjunto de datos. Para ello, se utilizó la función </w:t>
-      </w:r>
-      <w:r>
-        <w:rPr>
-          <w:rtl w:val="0"/>
-        </w:rPr>
-        <w:t xml:space="preserve">COUNT</w:t>
-      </w:r>
-      <w:r>
-        <w:rPr>
-          <w:rtl w:val="0"/>
-        </w:rPr>
-        <w:t xml:space="preserve"> junto con </w:t>
-      </w:r>
-      <w:r>
-        <w:rPr>
-          <w:rtl w:val="0"/>
-        </w:rPr>
-        <w:t xml:space="preserve">DISTINCT</w:t>
-      </w:r>
-      <w:r>
-        <w:rPr>
-          <w:rtl w:val="0"/>
-        </w:rPr>
-        <w:t xml:space="preserve">, lo que permite contar los valores diferentes sin repetirlos.</w:t>
-      </w:r>
-    </w:p>
-    <w:p>
-      <w:pPr>
-        <w:spacing w:after="240" w:before="240" w:lineRule="auto"/>
-        <w:ind w:firstLine="720"/>
-        <w:jc w:val="both"/>
-        <w:rPr/>
-      </w:pPr>
-      <w:r>
-        <w:rPr>
-          <w:rtl w:val="0"/>
-        </w:rPr>
-        <w:t xml:space="preserve">El resultado obtenido fue de 527 valores distintos en esta columna. Este resultado permite conocer la variedad de valores registrados y constituye un punto de partida para revisar posteriormente si existen categorías inconsistentes, diferencias de escritura o valores que requieran normalización. Sin embargo, la cantidad de valores distintos no implica que todos correspondan a categorías válidas ni que sean necesariamente inconsistentes. P15 permite repetir el conteo; P16, P21 y P22 amplían la revisión de frecuencias y variantes por mayúsculas, minúsculas y espacios, sin modificar los datos.</w:t>
+        <w:t xml:space="preserve">Posibles duplicados de contenido</w:t>
+      </w:r>
+    </w:p>
+    <w:p>
+      <w:pPr>
+        <w:spacing w:after="240" w:before="240" w:lineRule="auto"/>
+        <w:ind w:firstLine="720"/>
+        <w:jc w:val="both"/>
+        <w:rPr/>
+      </w:pPr>
+      <w:r>
+        <w:rPr>
+          <w:rtl w:val="0"/>
+        </w:rPr>
+        <w:t xml:space="preserve">Se detectaron 104 grupos candidatos con INSPECTION_ID diferentes, coincidencia en los campos comparados e igual longitud de VIOLATIONS. La consulta no compara el texto completo del CLOB; estos grupos no constituyen duplicados exactos confirmados ni justifican eliminar registros.</w:t>
+      </w:r>
+      <w:r>
+        <w:rPr>
+          <w:rtl w:val="0"/>
+        </w:rPr>
+        <w:t xml:space="preserve"/>
+      </w:r>
+      <w:r>
+        <w:rPr>
+          <w:rtl w:val="0"/>
+        </w:rPr>
+        <w:t xml:space="preserve"/>
+      </w:r>
+      <w:r>
+        <w:rPr>
+          <w:rtl w:val="0"/>
+        </w:rPr>
+        <w:t xml:space="preserve"/>
+      </w:r>
+      <w:r>
+        <w:rPr>
+          <w:rtl w:val="0"/>
+        </w:rPr>
+        <w:t xml:space="preserve"/>
       </w:r>
       <w:r>
         <w:rPr>
@@ -7956,157 +7641,21 @@
           <w:bCs w:val="1"/>
           <w:rtl w:val="0"/>
         </w:rPr>
-        <w:t xml:space="preserve">Revisión de los tipos de inspección</w:t>
-      </w:r>
-    </w:p>
-    <w:p>
-      <w:pPr>
-        <w:spacing w:after="240" w:before="240" w:lineRule="auto"/>
-        <w:ind w:left="0" w:firstLine="566.9291338582677"/>
-        <w:jc w:val="both"/>
-        <w:rPr/>
-      </w:pPr>
-      <w:r>
-        <w:rPr>
-          <w:rtl w:val="0"/>
-        </w:rPr>
-        <w:t xml:space="preserve">Se analizó la columna </w:t>
-      </w:r>
-      <w:r>
-        <w:rPr>
-          <w:rtl w:val="0"/>
-        </w:rPr>
-        <w:t xml:space="preserve">INSPECTION_TYPE</w:t>
-      </w:r>
-      <w:r>
-        <w:rPr>
-          <w:rtl w:val="0"/>
-        </w:rPr>
-        <w:t xml:space="preserve"> mediante una consulta SQL que agrupó los registros según su tipo de inspección y contabilizó la frecuencia de cada categoría. Para ello, se utilizó la cláusula </w:t>
-      </w:r>
-      <w:r>
-        <w:rPr>
-          <w:rtl w:val="0"/>
-        </w:rPr>
-        <w:t xml:space="preserve">GROUP BY</w:t>
-      </w:r>
-      <w:r>
-        <w:rPr>
-          <w:rtl w:val="0"/>
-        </w:rPr>
-        <w:t xml:space="preserve"> junto con la función </w:t>
-      </w:r>
-      <w:r>
-        <w:rPr>
-          <w:rtl w:val="0"/>
-        </w:rPr>
-        <w:t xml:space="preserve">COUNT(*)</w:t>
-      </w:r>
-      <w:r>
-        <w:rPr>
-          <w:rtl w:val="0"/>
-        </w:rPr>
-        <w:t xml:space="preserve">. Además, se aplicó </w:t>
-      </w:r>
-      <w:r>
-        <w:rPr>
-          <w:rtl w:val="0"/>
-        </w:rPr>
-        <w:t xml:space="preserve">ORDER BY</w:t>
-      </w:r>
-      <w:r>
-        <w:rPr>
-          <w:rtl w:val="0"/>
-        </w:rPr>
-        <w:t xml:space="preserve"> en orden descendente para mostrar primero las categorías con mayor cantidad de registros.</w:t>
-      </w:r>
-    </w:p>
-    <w:p>
-      <w:pPr>
-        <w:spacing w:after="240" w:before="240" w:lineRule="auto"/>
-        <w:ind w:left="0" w:firstLine="566.9291338582677"/>
-        <w:jc w:val="both"/>
-        <w:rPr/>
-      </w:pPr>
-      <w:r>
-        <w:rPr>
-          <w:rtl w:val="0"/>
-        </w:rPr>
-        <w:t xml:space="preserve">Entre los resultados obtenidos, la categoría más frecuente fue </w:t>
-      </w:r>
-      <w:r>
-        <w:rPr>
-          <w:rtl w:val="0"/>
-        </w:rPr>
-        <w:t xml:space="preserve">Canvass</w:t>
-      </w:r>
-      <w:r>
-        <w:rPr>
-          <w:rtl w:val="0"/>
-        </w:rPr>
-        <w:t xml:space="preserve">, con 163.611 registros, seguida de </w:t>
-      </w:r>
-      <w:r>
-        <w:rPr>
-          <w:rtl w:val="0"/>
-        </w:rPr>
-        <w:t xml:space="preserve">License</w:t>
-      </w:r>
-      <w:r>
-        <w:rPr>
-          <w:rtl w:val="0"/>
-        </w:rPr>
-        <w:t xml:space="preserve">, con 42.510 registros, y </w:t>
-      </w:r>
-      <w:r>
-        <w:rPr>
-          <w:rtl w:val="0"/>
-        </w:rPr>
-        <w:t xml:space="preserve">Canvass Re-Inspection</w:t>
-      </w:r>
-      <w:r>
-        <w:rPr>
-          <w:rtl w:val="0"/>
-        </w:rPr>
-        <w:t xml:space="preserve">, con 35.304 registros. Asimismo, la categoría </w:t>
-      </w:r>
-      <w:r>
-        <w:rPr>
-          <w:rtl w:val="0"/>
-        </w:rPr>
-        <w:t xml:space="preserve">Complaint</w:t>
-      </w:r>
-      <w:r>
-        <w:rPr>
-          <w:rtl w:val="0"/>
-        </w:rPr>
-        <w:t xml:space="preserve"> presentó 30.075 registros, mientras que </w:t>
-      </w:r>
-      <w:r>
-        <w:rPr>
-          <w:rtl w:val="0"/>
-        </w:rPr>
-        <w:t xml:space="preserve">License Re-Inspection</w:t>
-      </w:r>
-      <w:r>
-        <w:rPr>
-          <w:rtl w:val="0"/>
-        </w:rPr>
-        <w:t xml:space="preserve"> registró 12.852.</w:t>
-      </w:r>
-    </w:p>
-    <w:p>
-      <w:pPr>
-        <w:spacing w:after="240" w:before="240" w:lineRule="auto"/>
-        <w:ind w:left="0" w:firstLine="566.9291338582677"/>
-        <w:jc w:val="both"/>
-        <w:rPr/>
-      </w:pPr>
-      <w:r>
-        <w:rPr>
-          <w:rtl w:val="0"/>
-        </w:rPr>
-        <w:t xml:space="preserve">Estos resultados muestran que las inspecciones de tipo Canvass tienen una presencia considerable dentro del conjunto de datos. La distribución obtenida permite conocer cuáles son los tipos de inspección más frecuentes y sirve como base para análisis posteriores sobre la actividad de inspección. La identificación de posibles categorías inconsistentes requiere una revisión adicional de los valores registrados. La consulta de frecuencias quedó incorporada en P17. P18 a P24 amplían el diagnóstico de CITY, STATE y ZIP; sus resultados y las variantes de escritura están pendientes de revisar en Oracle.</w:t>
+        <w:t xml:space="preserve">Coordenadas geográficas</w:t>
+      </w:r>
+    </w:p>
+    <w:p>
+      <w:pPr>
+        <w:spacing w:after="240" w:before="240" w:lineRule="auto"/>
+        <w:ind w:firstLine="720"/>
+        <w:jc w:val="both"/>
+        <w:rPr/>
+      </w:pPr>
+      <w:r>
+        <w:rPr>
+          <w:rtl w:val="0"/>
+        </w:rPr>
+        <w:t xml:space="preserve">Los 315.900 valores no nulos de cada columna se convirtieron sin errores; LATITUDE y LONGITUDE tuvieron 1.061 faltantes cada una. Los rangos mostrados por SQL*Plus fueron de 41,6446701 a 42,0210642 para latitud y de -87,906874 a -87,525094 para longitud. No hubo valores fuera de -90 a 90 y -180 a 180, respectivamente. Esta validación de rangos generales no demuestra pertenencia exacta a Chicago.</w:t>
       </w:r>
       <w:r>
         <w:rPr>
@@ -8120,10 +7669,35 @@
         </w:rPr>
         <w:t xml:space="preserve"/>
       </w:r>
-    </w:p>
-    <w:p>
-      <w:pPr>
-        <w:spacing w:after="240" w:before="240" w:lineRule="auto"/>
+      <w:r>
+        <w:rPr>
+          <w:rtl w:val="0"/>
+        </w:rPr>
+        <w:t xml:space="preserve"/>
+      </w:r>
+      <w:r>
+        <w:rPr>
+          <w:rtl w:val="0"/>
+        </w:rPr>
+        <w:t xml:space="preserve"/>
+      </w:r>
+      <w:r>
+        <w:rPr>
+          <w:rtl w:val="0"/>
+        </w:rPr>
+        <w:t xml:space="preserve"/>
+      </w:r>
+      <w:r>
+        <w:rPr>
+          <w:rtl w:val="0"/>
+        </w:rPr>
+        <w:t xml:space="preserve"/>
+      </w:r>
+    </w:p>
+    <w:p>
+      <w:pPr>
+        <w:spacing w:after="240" w:before="240" w:lineRule="auto"/>
+        <w:jc w:val="both"/>
         <w:rPr>
           <w:b w:val="1"/>
           <w:bCs w:val="1"/>
@@ -8135,20 +7709,21 @@
           <w:bCs w:val="1"/>
           <w:rtl w:val="0"/>
         </w:rPr>
-        <w:t xml:space="preserve">Revisión del rango de fechas de las inspecciones</w:t>
-      </w:r>
-    </w:p>
-    <w:p>
-      <w:pPr>
-        <w:spacing w:after="240" w:before="240" w:lineRule="auto"/>
-        <w:ind w:firstLine="720"/>
-        <w:rPr/>
-      </w:pPr>
-      <w:r>
-        <w:rPr>
-          <w:rtl w:val="0"/>
-        </w:rPr>
-        <w:t xml:space="preserve">Se realizó una consulta SQL sobre la columna INSPECTION_DATE para identificar la fecha más antigua y la más reciente registradas en el conjunto de datos. Para ello, se utilizaron las funciones MIN() y MAX(), que permiten obtener, respectivamente, la fecha mínima y máxima. P03 presenta ambos extremos en formato YYYY-MM-DD para evitar ambigüedad entre día y mes.</w:t>
+        <w:t xml:space="preserve">Descripción de infracciones</w:t>
+      </w:r>
+    </w:p>
+    <w:p>
+      <w:pPr>
+        <w:spacing w:after="240" w:before="240" w:lineRule="auto"/>
+        <w:ind w:firstLine="720"/>
+        <w:jc w:val="both"/>
+        <w:rPr/>
+      </w:pPr>
+      <w:r>
+        <w:rPr>
+          <w:rtl w:val="0"/>
+        </w:rPr>
+        <w:t xml:space="preserve">VIOLATIONS presentó 89.410 NULL, cero textos vacíos o formados solo por espacios, una longitud máxima de 12.706 caracteres y 4.469 textos superiores a 4.000. Esto respalda el uso de CLOB para conservar descripciones extensas. Un NULL no demuestra ausencia de infracciones.</w:t>
       </w:r>
       <w:r>
         <w:rPr>
@@ -8190,35 +7765,38 @@
     <w:p>
       <w:pPr>
         <w:spacing w:after="240" w:before="240" w:lineRule="auto"/>
-        <w:ind w:firstLine="720"/>
-        <w:rPr/>
-      </w:pPr>
-      <w:r>
-        <w:rPr>
-          <w:rtl w:val="0"/>
-        </w:rPr>
-        <w:t xml:space="preserve">Las fechas anteriormente descritas como 1 de abril de 2010 y 10 de septiembre de 2026 no se consideran confirmadas. El CSV revisado, interpretado con el formato MM/DD/YYYY indicado durante la carga, abarca del 4 de enero de 2010 (2010-01-04) al 9 de octubre de 2026 (2026-10-09). Estas fechas se utilizan como referencia de contraste; el rango realmente almacenado en Oracle queda pendiente de confirmar mediante P03.</w:t>
-      </w:r>
-      <w:r>
+        <w:jc w:val="both"/>
         <w:rPr>
           <w:b w:val="1"/>
           <w:bCs w:val="1"/>
-          <w:rtl w:val="0"/>
-        </w:rPr>
-        <w:t xml:space="preserve"/>
-      </w:r>
-      <w:r>
-        <w:rPr>
-          <w:rtl w:val="0"/>
-        </w:rPr>
-        <w:t xml:space="preserve"/>
-      </w:r>
+        </w:rPr>
+      </w:pPr>
       <w:r>
         <w:rPr>
           <w:b w:val="1"/>
           <w:bCs w:val="1"/>
           <w:rtl w:val="0"/>
         </w:rPr>
+        <w:t xml:space="preserve">Licencias</w:t>
+      </w:r>
+    </w:p>
+    <w:p>
+      <w:pPr>
+        <w:spacing w:after="240" w:before="240" w:lineRule="auto"/>
+        <w:ind w:firstLine="720"/>
+        <w:jc w:val="both"/>
+        <w:rPr/>
+      </w:pPr>
+      <w:r>
+        <w:rPr>
+          <w:rtl w:val="0"/>
+        </w:rPr>
+        <w:t xml:space="preserve">LICENSE_NUMBER registró 19 NULL y 837 valores cero. Se mantuvieron sin cambios; su interpretación y tratamiento deberán justificarse antes de utilizar la licencia como identificador de establecimiento. El valor cero no se interpretó automáticamente como una licencia válida ni como un dato faltante.</w:t>
+      </w:r>
+      <w:r>
+        <w:rPr>
+          <w:rtl w:val="0"/>
+        </w:rPr>
         <w:t xml:space="preserve"/>
       </w:r>
       <w:r>
@@ -8227,68 +7805,6 @@
         </w:rPr>
         <w:t xml:space="preserve"/>
       </w:r>
-    </w:p>
-    <w:p>
-      <w:pPr>
-        <w:spacing w:after="240" w:before="240" w:lineRule="auto"/>
-        <w:ind w:firstLine="720"/>
-        <w:rPr/>
-      </w:pPr>
-      <w:r>
-        <w:rPr>
-          <w:rtl w:val="0"/>
-        </w:rPr>
-        <w:t xml:space="preserve">Para distinguir una interpretación incorrecta en la redacción de un posible problema de importación, P04 consulta específicamente los INSPECTION_ID 67757 y 2644019. Sus fechas esperadas según el CSV son 2010-01-04 y 2026-10-09, respectivamente. La consulta muestra la fecha de Oracle en formato YYYY-MM-DD y señala si coincide con la referencia, sin corregirla ni modificar registros.</w:t>
-      </w:r>
-    </w:p>
-    <w:p>
-      <w:pPr>
-        <w:spacing w:after="240" w:before="240" w:lineRule="auto"/>
-        <w:ind w:firstLine="720"/>
-        <w:rPr/>
-      </w:pPr>
-      <w:r>
-        <w:rPr>
-          <w:rtl w:val="0"/>
-        </w:rPr>
-        <w:t xml:space="preserve">Esta revisión permite identificar posibles anomalías temporales antes de realizar la limpieza y transformación de los datos. No se afirma la existencia de fechas del año 1 mientras no exista un resultado de Oracle que lo demuestre.</w:t>
-      </w:r>
-      <w:r>
-        <w:rPr>
-          <w:rtl w:val="0"/>
-        </w:rPr>
-      </w:r>
-    </w:p>
-    <w:p>
-      <w:pPr>
-        <w:spacing w:after="240" w:before="240" w:lineRule="auto"/>
-        <w:rPr>
-          <w:b w:val="1"/>
-          <w:bCs w:val="1"/>
-        </w:rPr>
-      </w:pPr>
-      <w:r>
-        <w:rPr>
-          <w:b w:val="1"/>
-          <w:bCs w:val="1"/>
-          <w:rtl w:val="0"/>
-        </w:rPr>
-        <w:t xml:space="preserve">Revisión de las coordenadas geográficas</w:t>
-      </w:r>
-    </w:p>
-    <w:p>
-      <w:pPr>
-        <w:spacing w:after="240" w:before="240" w:lineRule="auto"/>
-        <w:ind w:left="0" w:firstLine="566.9291338582677"/>
-        <w:jc w:val="both"/>
-        <w:rPr/>
-      </w:pPr>
-      <w:r>
-        <w:rPr>
-          <w:rtl w:val="0"/>
-        </w:rPr>
-        <w:t xml:space="preserve">Se realizó una consulta sobre las columnas LATITUDE y LONGITUDE con el objetivo de comprobar si las coordenadas registradas podían interpretarse como valores numéricos y si se encontraban dentro de los rangos geográficos permitidos. Para ello, se consideraron los límites de latitud, entre -90 y 90 grados, y de longitud, entre -180 y 180 grados. P25 a P28 amplían esta comprobación con conversión decimal explícita y comparación con LOCATION; su ejecución está pendiente.</w:t>
-      </w:r>
       <w:r>
         <w:rPr>
           <w:rtl w:val="0"/>
@@ -8312,148 +7828,6 @@
           <w:rtl w:val="0"/>
         </w:rPr>
         <w:t xml:space="preserve"/>
-      </w:r>
-    </w:p>
-    <w:p>
-      <w:pPr>
-        <w:spacing w:after="240" w:before="240" w:lineRule="auto"/>
-        <w:ind w:left="0" w:firstLine="566.9291338582677"/>
-        <w:jc w:val="both"/>
-        <w:rPr/>
-      </w:pPr>
-      <w:r>
-        <w:rPr>
-          <w:rtl w:val="0"/>
-        </w:rPr>
-        <w:t xml:space="preserve">La consulta inicial reportó 0 registros con coordenadas inválidas según los criterios aplicados en esa sesión de Oracle. Este resultado se conserva como antecedente del perfilado, pero no cierra la validación porque la conversión original no fijaba explícitamente la configuración decimal.</w:t>
-      </w:r>
-    </w:p>
-    <w:p>
-      <w:pPr>
-        <w:spacing w:after="240" w:before="240" w:lineRule="auto"/>
-        <w:ind w:left="0" w:firstLine="566.9291338582677"/>
-        <w:jc w:val="both"/>
-        <w:rPr/>
-      </w:pPr>
-      <w:r>
-        <w:rPr>
-          <w:rtl w:val="0"/>
-        </w:rPr>
-        <w:t xml:space="preserve">La validación ampliada utiliza un modelo numérico y NLS_NUMERIC_CHARACTERS explícitos para interpretar coma o punto decimal sin depender de la configuración regional de la sesión. P25 separa ausencia, errores de conversión y valores fuera de rango; P26 muestra ejemplos. P27 y P28 comparan LATITUDE y LONGITUDE con LOCATION cuando los tres están disponibles, con una tolerancia de 0,00000001 grados. Los resultados de estas consultas siguen pendientes de confirmación en Oracle.</w:t>
-      </w:r>
-    </w:p>
-    <w:p>
-      <w:pPr>
-        <w:spacing w:after="240" w:before="240" w:lineRule="auto"/>
-        <w:jc w:val="both"/>
-        <w:rPr/>
-      </w:pPr>
-      <w:r>
-        <w:rPr>
-          <w:rtl w:val="0"/>
-        </w:rPr>
-        <w:t xml:space="preserve">También quedan pendientes de ejecución P29 a P32, que verifican la longitud completa de VIOLATIONS, los textos superiores a 4.000 caracteres, los casos más largos y la ausencia de texto según RESULTS. P33 y P34 revisan LICENSE_NUMBER, distinguiendo NULL, cero y valores negativos. Estos diagnósticos no autorizan reemplazar ni eliminar información.</w:t>
-      </w:r>
-    </w:p>
-    <w:p>
-      <w:pPr>
-        <w:spacing w:after="240" w:before="240" w:lineRule="auto"/>
-        <w:rPr>
-          <w:b w:val="1"/>
-          <w:bCs w:val="1"/>
-        </w:rPr>
-      </w:pPr>
-      <w:r>
-        <w:rPr>
-          <w:b w:val="1"/>
-          <w:bCs w:val="1"/>
-          <w:rtl w:val="0"/>
-        </w:rPr>
-        <w:t xml:space="preserve">Resumen del perfilado inicial</w:t>
-      </w:r>
-    </w:p>
-    <w:p>
-      <w:pPr>
-        <w:spacing w:after="240" w:before="240" w:lineRule="auto"/>
-        <w:rPr/>
-      </w:pPr>
-      <w:r>
-        <w:rPr>
-          <w:rtl w:val="0"/>
-        </w:rPr>
-        <w:t xml:space="preserve">Los análisis iniciales permitieron identificar valores NULL en 12 de las 17 columnas, no encontrar identificadores INSPECTION_ID duplicados y conocer la distribución inicial de varias variables categóricas. El cierre del perfilado aún requiere confirmar el rango de fechas, los blancos, las repeticiones de contenido, las variantes de categorías y la validación geográfica ampliada. Una comprobación pendiente no se presenta como una anomalía confirmada.</w:t>
-      </w:r>
-      <w:r>
-        <w:rPr>
-          <w:rtl w:val="0"/>
-        </w:rPr>
-        <w:t xml:space="preserve"/>
-      </w:r>
-      <w:r>
-        <w:rPr>
-          <w:rtl w:val="0"/>
-        </w:rPr>
-        <w:t xml:space="preserve"/>
-      </w:r>
-    </w:p>
-    <w:p>
-      <w:pPr>
-        <w:spacing w:after="240" w:before="240" w:lineRule="auto"/>
-        <w:rPr/>
-      </w:pPr>
-      <w:r>
-        <w:rPr>
-          <w:rtl w:val="0"/>
-        </w:rPr>
-        <w:t xml:space="preserve">En cuanto a las categorías inconsistentes, la revisión todavía es parcial. Aunque no se encontraron inconsistencias evidentes en RESULTS y se conservó el valor original All en RISK durante el perfilado, aún es necesario completar la revisión de las demás variables categóricas para establecer una conclusión global.</w:t>
-      </w:r>
-      <w:r>
-        <w:rPr>
-          <w:rtl w:val="0"/>
-        </w:rPr>
-        <w:t xml:space="preserve"/>
-      </w:r>
-      <w:r>
-        <w:rPr>
-          <w:rtl w:val="0"/>
-        </w:rPr>
-        <w:t xml:space="preserve"/>
-      </w:r>
-      <w:r>
-        <w:rPr>
-          <w:rtl w:val="0"/>
-        </w:rPr>
-        <w:t xml:space="preserve"/>
-      </w:r>
-      <w:r>
-        <w:rPr>
-          <w:rtl w:val="0"/>
-        </w:rPr>
-        <w:t xml:space="preserve"/>
-      </w:r>
-      <w:r>
-        <w:rPr>
-          <w:rtl w:val="0"/>
-        </w:rPr>
-        <w:t xml:space="preserve"/>
-      </w:r>
-      <w:r>
-        <w:rPr>
-          <w:rtl w:val="0"/>
-        </w:rPr>
-        <w:t xml:space="preserve"/>
-      </w:r>
-    </w:p>
-    <w:p>
-      <w:pPr>
-        <w:spacing w:after="240" w:before="240" w:lineRule="auto"/>
-        <w:rPr/>
-      </w:pPr>
-      <w:r>
-        <w:rPr>
-          <w:rtl w:val="0"/>
-        </w:rPr>
-        <w:t xml:space="preserve">Durante esta etapa no se eliminaron ni modificaron registros. Los resultados obtenidos servirán como referencia para comparar el estado original del conjunto de datos con el resultado posterior a los procesos de limpieza, validación y transformación.</w:t>
       </w:r>
     </w:p>
     <w:p>
@@ -9060,7 +8434,7 @@
               <w:rPr>
                 <w:rtl w:val="0"/>
               </w:rPr>
-              <w:t xml:space="preserve">Hay NULL en 12 columnas; blancos pendientes de validar (P06-P07)</w:t>
+              <w:t xml:space="preserve">NULL en 12 columnas; tres ADDRESS con solo espacios</w:t>
             </w:r>
           </w:p>
         </w:tc>
@@ -9253,7 +8627,7 @@
               <w:rPr>
                 <w:rtl w:val="0"/>
               </w:rPr>
-              <w:t xml:space="preserve">RESULTS y RISK revisados; ampliación de categorías pendiente (P15-P24)</w:t>
+              <w:t xml:space="preserve">RESULTS: 7; RISK: tres niveles y All; FACILITY_TYPE: 527; INSPECTION_TYPE: 110</w:t>
             </w:r>
             <w:r>
               <w:rPr>
@@ -9368,7 +8742,7 @@
               <w:rPr>
                 <w:rtl w:val="0"/>
               </w:rPr>
-              <w:t xml:space="preserve">Rango de Oracle pendiente de confirmar en formato YYYY-MM-DD (P03-P04)</w:t>
+              <w:t xml:space="preserve">2010-01-04 a 2026-10-09; sin fechas NULL</w:t>
             </w:r>
           </w:p>
         </w:tc>
@@ -9459,7 +8833,7 @@
               <w:rPr>
                 <w:rtl w:val="0"/>
               </w:rPr>
-              <w:t xml:space="preserve">Control inicial: 0 inválidas; validación explícita pendiente (P25-P28)</w:t>
+              <w:t xml:space="preserve">1.061 faltantes por columna; conversión correcta; 0 fuera de rango</w:t>
             </w:r>
           </w:p>
         </w:tc>
@@ -9555,7 +8929,7 @@
               <w:rPr>
                 <w:rtl w:val="0"/>
               </w:rPr>
-              <w:t xml:space="preserve">Intervalos disponibles; máximo y textos &gt;4.000 pendientes (P29-P31)</w:t>
+              <w:t xml:space="preserve">Máximo: 12.706 caracteres; 4.469 textos &gt;4.000; 89.410 NULL</w:t>
             </w:r>
           </w:p>
         </w:tc>
@@ -9634,7 +9008,7 @@
         <w:rPr>
           <w:rtl w:val="0"/>
         </w:rPr>
-        <w:t xml:space="preserve">La etapa de Data Engineering recibe como entrada el archivo CSV original de Chicago Food Inspections y lo almacena inicialmente en Oracle. Se inició el perfilado y se prepararon sus consultas de validación ampliada, cuyos resultados todavía deben confirmarse. La limpieza y las transformaciones posteriores no se han iniciado.</w:t>
+        <w:t xml:space="preserve">Data Engineering recibe el CSV original de Chicago Food Inspections y lo almacena en Oracle. El perfilado se completó mediante 12 consultas SELECT, con resultados verificados. La limpieza y transformación siguen pendientes; todavía no se dispone del conjunto de datos preparados.</w:t>
       </w:r>
     </w:p>
     <w:p>

</xml_diff>

<commit_message>
Investigacion actualizada con Limpieza
</commit_message>
<xml_diff>
--- a/documento/Investigacion (1).docx
+++ b/documento/Investigacion (1).docx
@@ -8093,7 +8093,7 @@
               <w:rPr>
                 <w:rtl w:val="0"/>
               </w:rPr>
-              <w:t xml:space="preserve">Pendiente de completar</w:t>
+              <w:t xml:space="preserve">FOOD_INSPECTIONS_RAW</w:t>
             </w:r>
           </w:p>
         </w:tc>
@@ -8189,7 +8189,7 @@
               <w:rPr>
                 <w:rtl w:val="0"/>
               </w:rPr>
-              <w:t xml:space="preserve">Pendiente de crear o definir</w:t>
+              <w:t xml:space="preserve">CLEAN</w:t>
             </w:r>
           </w:p>
         </w:tc>
@@ -8280,7 +8280,7 @@
               <w:rPr>
                 <w:rtl w:val="0"/>
               </w:rPr>
-              <w:t xml:space="preserve">Pendiente de verificar</w:t>
+              <w:t xml:space="preserve">316.961</w:t>
             </w:r>
           </w:p>
         </w:tc>
@@ -8371,7 +8371,7 @@
               <w:rPr>
                 <w:rtl w:val="0"/>
               </w:rPr>
-              <w:t xml:space="preserve">Pendiente de verificar</w:t>
+              <w:t xml:space="preserve">17</w:t>
             </w:r>
           </w:p>
         </w:tc>
@@ -8462,7 +8462,7 @@
               <w:rPr>
                 <w:rtl w:val="0"/>
               </w:rPr>
-              <w:t xml:space="preserve">Pendiente: indicar cuáles se trataron y cómo</w:t>
+              <w:t xml:space="preserve">3 ADDRESS pasaron a NULL; demás faltantes conservados</w:t>
             </w:r>
           </w:p>
         </w:tc>
@@ -8564,7 +8564,7 @@
               <w:rPr>
                 <w:rtl w:val="0"/>
               </w:rPr>
-              <w:t xml:space="preserve">Pendiente de verificar después de las transformaciones</w:t>
+              <w:t xml:space="preserve">0; se conservaron todas las filas</w:t>
             </w:r>
           </w:p>
         </w:tc>
@@ -8679,7 +8679,7 @@
               <w:rPr>
                 <w:rtl w:val="0"/>
               </w:rPr>
-              <w:t xml:space="preserve">Pendiente</w:t>
+              <w:t xml:space="preserve">FACILITY_TYPE: 473; INSPECTION_TYPE: 98; RESULTS y RISK conservados</w:t>
             </w:r>
           </w:p>
         </w:tc>
@@ -8770,7 +8770,7 @@
               <w:rPr>
                 <w:rtl w:val="0"/>
               </w:rPr>
-              <w:t xml:space="preserve">Pendiente de validar y tratar</w:t>
+              <w:t xml:space="preserve">Mismo rango; fechas conservadas</w:t>
             </w:r>
           </w:p>
         </w:tc>
@@ -8861,7 +8861,7 @@
               <w:rPr>
                 <w:rtl w:val="0"/>
               </w:rPr>
-              <w:t xml:space="preserve">Pendiente</w:t>
+              <w:t xml:space="preserve">NUMBER; 1.061 NULL; 0 fuera de rango</w:t>
             </w:r>
           </w:p>
         </w:tc>
@@ -8957,7 +8957,7 @@
               <w:rPr>
                 <w:rtl w:val="0"/>
               </w:rPr>
-              <w:t xml:space="preserve">Pendiente</w:t>
+              <w:t xml:space="preserve">CLOB; mismas longitudes y 89.410 NULL</w:t>
             </w:r>
           </w:p>
         </w:tc>
@@ -9008,7 +9008,7 @@
         <w:rPr>
           <w:rtl w:val="0"/>
         </w:rPr>
-        <w:t xml:space="preserve">Data Engineering recibe el CSV original de Chicago Food Inspections y lo almacena en Oracle. El perfilado se completó mediante 12 consultas SELECT, con resultados verificados. La limpieza y transformación siguen pendientes; todavía no se dispone del conjunto de datos preparados.</w:t>
+        <w:t xml:space="preserve">El perfilado y la limpieza aprobada se completaron en Oracle. Se aplicó TRIM a ADDRESS, UPPER(TRIM()) a FACILITY_TYPE e INSPECTION_TYPE y la conversión explícita de coordenadas a NUMBER. CLEAN conserva las 316.961 filas; RAW permanece intacta. Las validaciones coincidieron con lo esperado y no se eliminaron candidatos a duplicados.</w:t>
       </w:r>
     </w:p>
     <w:p>
@@ -9022,7 +9022,7 @@
         <w:rPr>
           <w:rtl w:val="0"/>
         </w:rPr>
-        <w:t xml:space="preserve">El principal entregable de esta etapa será una tabla o conjunto de tablas con datos preparados para ser utilizados posteriormente por Data Analytics y Data Science.</w:t>
+        <w:t xml:space="preserve">FOOD_INSPECTIONS_CLEAN entrega 17 columnas a Data Analytics y Data Science. El proceso se conserva en sql/03cleaning.sql y evidencias/limpieza/.</w:t>
       </w:r>
     </w:p>
     <w:p>

</xml_diff>

<commit_message>
Complete Data Engineering and Data Analytics documentation
</commit_message>
<xml_diff>
--- a/documento/Investigacion (1).docx
+++ b/documento/Investigacion (1).docx
@@ -7057,7 +7057,7 @@
         <w:rPr>
           <w:rtl w:val="0"/>
         </w:rPr>
-        <w:t xml:space="preserve">RESULTS presentó siete categorías; Pass (164.074) y Fail (61.038) fueron las más frecuentes. RISK mostró los tres niveles de riesgo, además de 87 valores All y 87 NULL. FACILITY_TYPE e INSPECTION_TYPE registraron 527 y 110 valores distintos no nulos, respectivamente. Canvass fue el tipo de inspección más frecuente (163.611). Se observaron variantes de escritura, como BANQUET HALL/Banquet Hall y No Entry/NO ENTRY. El significado de All y las reglas de normalización permanecen pendientes.</w:t>
+        <w:t xml:space="preserve">RESULTS presentó siete categorías; Pass (164.074) y Fail (61.038) fueron las más frecuentes. RISK mostró los tres niveles de riesgo, además de 87 valores All y 87 NULL. FACILITY_TYPE e INSPECTION_TYPE registraron 527 y 110 valores distintos no nulos, respectivamente. Canvass fue el tipo de inspección más frecuente (163.611). Se observaron variantes de escritura, como BANQUET HALL/Banquet Hall y No Entry/NO ENTRY. UPPER(TRIM()) ya se aplicó a FACILITY_TYPE e INSPECTION_TYPE. RISK = All se conservó sin cambios, sin reinterpretarlo ni reclasificarlo.</w:t>
       </w:r>
       <w:r>
         <w:rPr>
@@ -9097,6 +9097,230 @@
         <w:t xml:space="preserve">[Pendiente después de finalizar el caso.]</w:t>
       </w:r>
     </w:p>
+    <w:p>
+      <w:pPr>
+        <w:pStyle w:val="Heading1"/>
+        <w:keepNext/>
+        <w:pageBreakBefore/>
+        <w:spacing w:before="0" w:after="200" w:line="360" w:lineRule="auto"/>
+        <w:ind w:left="0" w:right="0" w:firstLine="0"/>
+        <w:jc w:val="center"/>
+      </w:pPr>
+      <w:r>
+        <w:rPr>
+          <w:rFonts w:ascii="Times New Roman" w:hAnsi="Times New Roman" w:eastAsia="Times New Roman" w:cs="Times New Roman"/>
+          <w:sz w:val="24"/>
+          <w:szCs w:val="24"/>
+          <w:b/>
+          <w:bCs/>
+        </w:rPr>
+        <w:t xml:space="preserve">Referencias</w:t>
+      </w:r>
+    </w:p>
+    <w:p>
+      <w:pPr>
+        <w:keepLines/>
+        <w:spacing w:before="0" w:after="200" w:line="360" w:lineRule="auto"/>
+        <w:ind w:left="720" w:hanging="720"/>
+        <w:jc w:val="left"/>
+      </w:pPr>
+      <w:r>
+        <w:rPr>
+          <w:rFonts w:ascii="Times New Roman" w:hAnsi="Times New Roman" w:eastAsia="Times New Roman" w:cs="Times New Roman"/>
+          <w:sz w:val="24"/>
+          <w:szCs w:val="24"/>
+        </w:rPr>
+        <w:t xml:space="preserve">Heck, P. (2024). What about the data? A mapping study on data engineering for AI systems. En </w:t>
+      </w:r>
+      <w:r>
+        <w:rPr>
+          <w:rFonts w:ascii="Times New Roman" w:hAnsi="Times New Roman" w:eastAsia="Times New Roman" w:cs="Times New Roman"/>
+          <w:sz w:val="24"/>
+          <w:szCs w:val="24"/>
+          <w:i/>
+          <w:iCs/>
+        </w:rPr>
+        <w:t xml:space="preserve">Proceedings of the 2024 IEEE/ACM 3rd International Conference on AI Engineering – Software Engineering for AI (CAIN 2024)</w:t>
+      </w:r>
+      <w:r>
+        <w:rPr>
+          <w:rFonts w:ascii="Times New Roman" w:hAnsi="Times New Roman" w:eastAsia="Times New Roman" w:cs="Times New Roman"/>
+          <w:sz w:val="24"/>
+          <w:szCs w:val="24"/>
+        </w:rPr>
+        <w:t xml:space="preserve"> (pp. 43–52). Association for Computing Machinery. https://doi.org/10.1145/3644815.3644954</w:t>
+      </w:r>
+    </w:p>
+    <w:p>
+      <w:pPr>
+        <w:keepLines/>
+        <w:spacing w:before="0" w:after="200" w:line="360" w:lineRule="auto"/>
+        <w:ind w:left="720" w:hanging="720"/>
+        <w:jc w:val="left"/>
+      </w:pPr>
+      <w:r>
+        <w:rPr>
+          <w:rFonts w:ascii="Times New Roman" w:hAnsi="Times New Roman" w:eastAsia="Times New Roman" w:cs="Times New Roman"/>
+          <w:sz w:val="24"/>
+          <w:szCs w:val="24"/>
+        </w:rPr>
+        <w:t xml:space="preserve">Huyen, C. (2023). </w:t>
+      </w:r>
+      <w:r>
+        <w:rPr>
+          <w:rFonts w:ascii="Times New Roman" w:hAnsi="Times New Roman" w:eastAsia="Times New Roman" w:cs="Times New Roman"/>
+          <w:sz w:val="24"/>
+          <w:szCs w:val="24"/>
+          <w:i/>
+          <w:iCs/>
+        </w:rPr>
+        <w:t xml:space="preserve">Diseño de sistemas de machine learning</w:t>
+      </w:r>
+      <w:r>
+        <w:rPr>
+          <w:rFonts w:ascii="Times New Roman" w:hAnsi="Times New Roman" w:eastAsia="Times New Roman" w:cs="Times New Roman"/>
+          <w:sz w:val="24"/>
+          <w:szCs w:val="24"/>
+        </w:rPr>
+        <w:t xml:space="preserve"> (M. Á. Torres, Trad.). Marcombo.</w:t>
+      </w:r>
+    </w:p>
+    <w:p>
+      <w:pPr>
+        <w:keepLines/>
+        <w:spacing w:before="0" w:after="200" w:line="360" w:lineRule="auto"/>
+        <w:ind w:left="720" w:hanging="720"/>
+        <w:jc w:val="left"/>
+      </w:pPr>
+      <w:r>
+        <w:rPr>
+          <w:rFonts w:ascii="Times New Roman" w:hAnsi="Times New Roman" w:eastAsia="Times New Roman" w:cs="Times New Roman"/>
+          <w:sz w:val="24"/>
+          <w:szCs w:val="24"/>
+        </w:rPr>
+        <w:t xml:space="preserve">Kleppmann, M. (2017). </w:t>
+      </w:r>
+      <w:r>
+        <w:rPr>
+          <w:rFonts w:ascii="Times New Roman" w:hAnsi="Times New Roman" w:eastAsia="Times New Roman" w:cs="Times New Roman"/>
+          <w:sz w:val="24"/>
+          <w:szCs w:val="24"/>
+          <w:i/>
+          <w:iCs/>
+        </w:rPr>
+        <w:t xml:space="preserve">Designing data-intensive applications: The big ideas behind reliable, scalable, and maintainable systems</w:t>
+      </w:r>
+      <w:r>
+        <w:rPr>
+          <w:rFonts w:ascii="Times New Roman" w:hAnsi="Times New Roman" w:eastAsia="Times New Roman" w:cs="Times New Roman"/>
+          <w:sz w:val="24"/>
+          <w:szCs w:val="24"/>
+        </w:rPr>
+        <w:t xml:space="preserve">. O’Reilly Media.</w:t>
+      </w:r>
+    </w:p>
+    <w:p>
+      <w:pPr>
+        <w:keepLines/>
+        <w:spacing w:before="0" w:after="200" w:line="360" w:lineRule="auto"/>
+        <w:ind w:left="720" w:hanging="720"/>
+        <w:jc w:val="left"/>
+      </w:pPr>
+      <w:r>
+        <w:rPr>
+          <w:rFonts w:ascii="Times New Roman" w:hAnsi="Times New Roman" w:eastAsia="Times New Roman" w:cs="Times New Roman"/>
+          <w:sz w:val="24"/>
+          <w:szCs w:val="24"/>
+        </w:rPr>
+        <w:t xml:space="preserve">Mazumdar, D., Hughes, J., &amp; Onofré, J.-B. (2023). </w:t>
+      </w:r>
+      <w:r>
+        <w:rPr>
+          <w:rFonts w:ascii="Times New Roman" w:hAnsi="Times New Roman" w:eastAsia="Times New Roman" w:cs="Times New Roman"/>
+          <w:sz w:val="24"/>
+          <w:szCs w:val="24"/>
+          <w:i/>
+          <w:iCs/>
+        </w:rPr>
+        <w:t xml:space="preserve">The data lakehouse: Data warehousing and more</w:t>
+      </w:r>
+      <w:r>
+        <w:rPr>
+          <w:rFonts w:ascii="Times New Roman" w:hAnsi="Times New Roman" w:eastAsia="Times New Roman" w:cs="Times New Roman"/>
+          <w:sz w:val="24"/>
+          <w:szCs w:val="24"/>
+        </w:rPr>
+        <w:t xml:space="preserve"> [Prepublicación]. arXiv. https://doi.org/10.48550/arXiv.2310.08697</w:t>
+      </w:r>
+    </w:p>
+    <w:p>
+      <w:pPr>
+        <w:keepLines/>
+        <w:spacing w:before="0" w:after="200" w:line="360" w:lineRule="auto"/>
+        <w:ind w:left="720" w:hanging="720"/>
+        <w:jc w:val="left"/>
+      </w:pPr>
+      <w:r>
+        <w:rPr>
+          <w:rFonts w:ascii="Times New Roman" w:hAnsi="Times New Roman" w:eastAsia="Times New Roman" w:cs="Times New Roman"/>
+          <w:sz w:val="24"/>
+          <w:szCs w:val="24"/>
+        </w:rPr>
+        <w:t xml:space="preserve">Reis, J., &amp; Housley, M. (2022). </w:t>
+      </w:r>
+      <w:r>
+        <w:rPr>
+          <w:rFonts w:ascii="Times New Roman" w:hAnsi="Times New Roman" w:eastAsia="Times New Roman" w:cs="Times New Roman"/>
+          <w:sz w:val="24"/>
+          <w:szCs w:val="24"/>
+          <w:i/>
+          <w:iCs/>
+        </w:rPr>
+        <w:t xml:space="preserve">Fundamentals of data engineering: Plan and build robust data systems</w:t>
+      </w:r>
+      <w:r>
+        <w:rPr>
+          <w:rFonts w:ascii="Times New Roman" w:hAnsi="Times New Roman" w:eastAsia="Times New Roman" w:cs="Times New Roman"/>
+          <w:sz w:val="24"/>
+          <w:szCs w:val="24"/>
+        </w:rPr>
+        <w:t xml:space="preserve">. O’Reilly Media.</w:t>
+      </w:r>
+    </w:p>
+    <w:p>
+      <w:pPr>
+        <w:keepLines/>
+        <w:spacing w:before="0" w:after="200" w:line="360" w:lineRule="auto"/>
+        <w:ind w:left="720" w:hanging="720"/>
+        <w:jc w:val="left"/>
+      </w:pPr>
+      <w:r>
+        <w:rPr>
+          <w:rFonts w:ascii="Times New Roman" w:hAnsi="Times New Roman" w:eastAsia="Times New Roman" w:cs="Times New Roman"/>
+          <w:sz w:val="24"/>
+          <w:szCs w:val="24"/>
+        </w:rPr>
+        <w:t xml:space="preserve">Wells, D. (2020). </w:t>
+      </w:r>
+      <w:r>
+        <w:rPr>
+          <w:rFonts w:ascii="Times New Roman" w:hAnsi="Times New Roman" w:eastAsia="Times New Roman" w:cs="Times New Roman"/>
+          <w:sz w:val="24"/>
+          <w:szCs w:val="24"/>
+          <w:i/>
+          <w:iCs/>
+        </w:rPr>
+        <w:t xml:space="preserve">Architecting and automating data pipelines: A guide to efficient data engineering for BI and data science</w:t>
+      </w:r>
+      <w:r>
+        <w:rPr>
+          <w:rFonts w:ascii="Times New Roman" w:hAnsi="Times New Roman" w:eastAsia="Times New Roman" w:cs="Times New Roman"/>
+          <w:sz w:val="24"/>
+          <w:szCs w:val="24"/>
+        </w:rPr>
+        <w:t xml:space="preserve">. Eckerson Group. https://info.minitab.com/hubfs/pdf/minitab-eckerson-report-architecting-automating-data-pipelines.pdf</w:t>
+      </w:r>
+    </w:p>
     <w:sectPr>
       <w:headerReference r:id="rId13" w:type="default"/>
       <w:footerReference r:id="rId14" w:type="default"/>

</xml_diff>

<commit_message>
Documento investigacion, y guia para estudiar
</commit_message>
<xml_diff>
--- a/documento/Investigacion (1).docx
+++ b/documento/Investigacion (1).docx
@@ -8820,10 +8820,7 @@
         <w:widowControl w:val="1"/>
       </w:pPr>
       <w:r>
-        <w:rPr>
-          <w:rtl w:val="0"/>
-        </w:rPr>
-        <w:t xml:space="preserve">Data Science utilizará los datos preparados durante Data Engineering y los resultados obtenidos mediante Data Analytics para desarrollar un análisis de mayor complejidad mediante técnicas estadísticas o de aprendizaje automático.</w:t>
+        <w:t>Pregunta predictiva: ¿Podemos predecir Fail en inspecciones con resultado Fail, Pass o Pass w/ Conditions utilizando información previa al resultado? El target se definió como Fail = 1; Pass y Pass w/ Conditions = 0.</w:t>
       </w:r>
     </w:p>
     <w:p>
@@ -8835,107 +8832,1270 @@
         <w:widowControl w:val="1"/>
       </w:pPr>
       <w:r>
-        <w:rPr>
-          <w:rtl w:val="0"/>
-        </w:rPr>
-        <w:t xml:space="preserve">La implementación se realizará utilizando Python y herramientas destinadas a la preparación, modelado y evaluación de los datos.</w:t>
+        <w:t>Conjunto utilizado: La vista de solo lectura FOOD_INSPECTIONS_SCIENCE consulta FOOD_INSPECTIONS_CLEAN sin duplicar ni modificar sus datos. Incluye los tres RESULTS indicados, excluye NON-INSPECTION y abarca 2019–2025. Quedaron 103.596 registros: 23.838 Fail y 79.758 No Fail; se apartaron 18 NON-INSPECTION de ese periodo.</w:t>
       </w:r>
     </w:p>
     <w:p>
       <w:pPr>
         <w:spacing w:after="200" w:before="0" w:lineRule="auto" w:line="360"/>
-        <w:rPr/>
-        <w:ind w:left="0" w:right="0" w:firstLine="0"/>
-        <w:jc w:val="left"/>
-      </w:pPr>
-      <w:r>
-        <w:rPr>
-          <w:b w:val="1"/>
-          <w:bCs w:val="1"/>
-          <w:rtl w:val="0"/>
-        </w:rPr>
-        <w:t xml:space="preserve">Problema a resolver:</w:t>
-      </w:r>
-      <w:r>
-        <w:rPr>
-          <w:rtl w:val="0"/>
-        </w:rPr>
-        <w:t xml:space="preserve"> [Pendiente]</w:t>
-        <w:br w:type="textWrapping"/>
-      </w:r>
-      <w:r>
-        <w:rPr>
-          <w:b w:val="1"/>
-          <w:bCs w:val="1"/>
-          <w:rtl w:val="0"/>
-        </w:rPr>
-        <w:t xml:space="preserve">Variable objetivo:</w:t>
-      </w:r>
-      <w:r>
-        <w:rPr>
-          <w:rtl w:val="0"/>
-        </w:rPr>
-        <w:t xml:space="preserve"> [Pendiente]</w:t>
-        <w:br w:type="textWrapping"/>
-      </w:r>
-      <w:r>
-        <w:rPr>
-          <w:b w:val="1"/>
-          <w:bCs w:val="1"/>
-          <w:rtl w:val="0"/>
-        </w:rPr>
-        <w:t xml:space="preserve">Variables utilizadas:</w:t>
-      </w:r>
-      <w:r>
-        <w:rPr>
-          <w:rtl w:val="0"/>
-        </w:rPr>
-        <w:t xml:space="preserve"> [Pendiente]</w:t>
-        <w:br w:type="textWrapping"/>
-      </w:r>
-      <w:r>
-        <w:rPr>
-          <w:b w:val="1"/>
-          <w:bCs w:val="1"/>
-          <w:rtl w:val="0"/>
-        </w:rPr>
-        <w:t xml:space="preserve">Modelo seleccionado:</w:t>
-      </w:r>
-      <w:r>
-        <w:rPr>
-          <w:rtl w:val="0"/>
-        </w:rPr>
-        <w:t xml:space="preserve"> [Pendiente]</w:t>
-        <w:br w:type="textWrapping"/>
-      </w:r>
-      <w:r>
-        <w:rPr>
-          <w:b w:val="1"/>
-          <w:bCs w:val="1"/>
-          <w:rtl w:val="0"/>
-        </w:rPr>
-        <w:t xml:space="preserve">Resultados:</w:t>
-      </w:r>
-      <w:r>
-        <w:rPr>
-          <w:rtl w:val="0"/>
-        </w:rPr>
-        <w:t xml:space="preserve"> [Pendiente]</w:t>
-        <w:br w:type="textWrapping"/>
-      </w:r>
-      <w:r>
-        <w:rPr>
-          <w:b w:val="1"/>
-          <w:bCs w:val="1"/>
-          <w:rtl w:val="0"/>
-        </w:rPr>
-        <w:t xml:space="preserve">Limitaciones:</w:t>
-      </w:r>
-      <w:r>
-        <w:rPr>
-          <w:rtl w:val="0"/>
-        </w:rPr>
-        <w:t xml:space="preserve"> [Pendiente]</w:t>
+        <w:ind w:firstLine="720"/>
+        <w:rPr/>
+        <w:jc w:val="both"/>
+        <w:widowControl w:val="1"/>
+      </w:pPr>
+      <w:r>
+        <w:t>Predictores: RISK, FACILITY_TYPE, ZIP y MES. Los NULL se representaron como SIN DATO. RESULTS solo forma el target; VIOLATIONS se excluyó porque contiene hallazgos de la propia inspección. Nombres, direcciones, licencias, ubicación y coordenadas se excluyeron por posible memorización de establecimientos. INSPECTION_TYPE se utilizó únicamente en el filtro; ANO, únicamente para separar los periodos.</w:t>
+      </w:r>
+    </w:p>
+    <w:p>
+      <w:pPr>
+        <w:spacing w:after="200" w:before="0" w:lineRule="auto" w:line="360"/>
+        <w:ind w:firstLine="720"/>
+        <w:rPr/>
+        <w:jc w:val="both"/>
+        <w:widowControl w:val="1"/>
+      </w:pPr>
+      <w:r>
+        <w:t>División temporal: Train utilizó 87.539 registros de 2019–2024, con 20.447 Fail (23,36 %). Test utilizó 16.057 registros de 2025, con 3.391 Fail (21,12 %). La codificación categórica se aprendió solo con train y admite categorías desconocidas en test. Se reservó 2026 por estar incompleto hasta el 9 de octubre; no participó en el experimento.</w:t>
+      </w:r>
+    </w:p>
+    <w:p>
+      <w:pPr>
+        <w:spacing w:after="200" w:before="0" w:lineRule="auto" w:line="360"/>
+        <w:ind w:firstLine="720"/>
+        <w:rPr/>
+        <w:jc w:val="both"/>
+        <w:widowControl w:val="1"/>
+      </w:pPr>
+      <w:r>
+        <w:t>Modelos e implementación: Se entrenaron Regresión Logística y Árbol de Decisión con pesos de clase balanceados calculados en train. El árbol se limitó a profundidad 4 y mínimo de 100 registros por hoja; obtuvo 11 hojas. Los parámetros se fijaron antes de evaluar. La implementación quedó organizada en python/01_data_prep.py, python/02_models.py y python/03_evaluate.py.</w:t>
+      </w:r>
+    </w:p>
+    <w:p>
+      <w:pPr>
+        <w:spacing w:after="200" w:before="0" w:lineRule="auto" w:line="360"/>
+        <w:ind w:firstLine="720"/>
+        <w:rPr/>
+        <w:jc w:val="both"/>
+        <w:widowControl w:val="1"/>
+        <w:keepNext w:val="1"/>
+      </w:pPr>
+      <w:r>
+        <w:t>Evaluación: El baseline predijo siempre No Fail, la clase mayoritaria de train. Las métricas siguientes corresponden a test, con Fail como clase positiva, y se expresan de 0 a 1.</w:t>
+      </w:r>
+    </w:p>
+    <w:tbl>
+      <w:tblPr>
+        <w:tblW w:w="9360" w:type="dxa"/>
+        <w:jc w:val="center"/>
+        <w:tblLayout w:type="fixed"/>
+        <w:tblBorders>
+          <w:top w:val="single" w:sz="4" w:color="D9D9D9"/>
+          <w:left w:val="single" w:sz="4" w:color="D9D9D9"/>
+          <w:bottom w:val="single" w:sz="4" w:color="D9D9D9"/>
+          <w:right w:val="single" w:sz="4" w:color="D9D9D9"/>
+          <w:insideH w:val="single" w:sz="4" w:color="D9D9D9"/>
+          <w:insideV w:val="single" w:sz="4" w:color="D9D9D9"/>
+        </w:tblBorders>
+        <w:tblCellMar>
+          <w:top w:w="75" w:type="dxa"/>
+          <w:bottom w:w="75" w:type="dxa"/>
+          <w:left w:w="100" w:type="dxa"/>
+          <w:right w:w="100" w:type="dxa"/>
+        </w:tblCellMar>
+      </w:tblPr>
+      <w:tblGrid>
+        <w:gridCol w:w="2760"/>
+        <w:gridCol w:w="1650"/>
+        <w:gridCol w:w="1650"/>
+        <w:gridCol w:w="1650"/>
+        <w:gridCol w:w="1650"/>
+      </w:tblGrid>
+      <w:tr>
+        <w:trPr>
+          <w:cantSplit/>
+          <w:tblHeader/>
+        </w:trPr>
+        <w:tc>
+          <w:tcPr>
+            <w:tcW w:w="2760" w:type="dxa"/>
+            <w:vAlign w:val="center"/>
+            <w:shd w:val="clear" w:fill="E7EDF3"/>
+          </w:tcPr>
+          <w:p>
+            <w:pPr>
+              <w:spacing w:before="0" w:after="0" w:line="264" w:lineRule="auto"/>
+              <w:ind w:left="0" w:right="0" w:firstLine="0"/>
+              <w:jc w:val="left"/>
+              <w:keepNext w:val="1"/>
+            </w:pPr>
+            <w:r>
+              <w:rPr>
+                <w:rFonts w:ascii="Times New Roman" w:hAnsi="Times New Roman"/>
+                <w:sz w:val="22"/>
+                <w:szCs w:val="22"/>
+                <w:b w:val="1"/>
+              </w:rPr>
+              <w:t>Modelo</w:t>
+            </w:r>
+          </w:p>
+        </w:tc>
+        <w:tc>
+          <w:tcPr>
+            <w:tcW w:w="1650" w:type="dxa"/>
+            <w:vAlign w:val="center"/>
+            <w:shd w:val="clear" w:fill="E7EDF3"/>
+          </w:tcPr>
+          <w:p>
+            <w:pPr>
+              <w:spacing w:before="0" w:after="0" w:line="264" w:lineRule="auto"/>
+              <w:ind w:left="0" w:right="0" w:firstLine="0"/>
+              <w:jc w:val="center"/>
+              <w:keepNext w:val="1"/>
+            </w:pPr>
+            <w:r>
+              <w:rPr>
+                <w:rFonts w:ascii="Times New Roman" w:hAnsi="Times New Roman"/>
+                <w:sz w:val="22"/>
+                <w:szCs w:val="22"/>
+                <w:b w:val="1"/>
+              </w:rPr>
+              <w:t>Accuracy</w:t>
+            </w:r>
+          </w:p>
+        </w:tc>
+        <w:tc>
+          <w:tcPr>
+            <w:tcW w:w="1650" w:type="dxa"/>
+            <w:vAlign w:val="center"/>
+            <w:shd w:val="clear" w:fill="E7EDF3"/>
+          </w:tcPr>
+          <w:p>
+            <w:pPr>
+              <w:spacing w:before="0" w:after="0" w:line="264" w:lineRule="auto"/>
+              <w:ind w:left="0" w:right="0" w:firstLine="0"/>
+              <w:jc w:val="center"/>
+              <w:keepNext w:val="1"/>
+            </w:pPr>
+            <w:r>
+              <w:rPr>
+                <w:rFonts w:ascii="Times New Roman" w:hAnsi="Times New Roman"/>
+                <w:sz w:val="22"/>
+                <w:szCs w:val="22"/>
+                <w:b w:val="1"/>
+              </w:rPr>
+              <w:t>Precision Fail</w:t>
+            </w:r>
+          </w:p>
+        </w:tc>
+        <w:tc>
+          <w:tcPr>
+            <w:tcW w:w="1650" w:type="dxa"/>
+            <w:vAlign w:val="center"/>
+            <w:shd w:val="clear" w:fill="E7EDF3"/>
+          </w:tcPr>
+          <w:p>
+            <w:pPr>
+              <w:spacing w:before="0" w:after="0" w:line="264" w:lineRule="auto"/>
+              <w:ind w:left="0" w:right="0" w:firstLine="0"/>
+              <w:jc w:val="center"/>
+              <w:keepNext w:val="1"/>
+            </w:pPr>
+            <w:r>
+              <w:rPr>
+                <w:rFonts w:ascii="Times New Roman" w:hAnsi="Times New Roman"/>
+                <w:sz w:val="22"/>
+                <w:szCs w:val="22"/>
+                <w:b w:val="1"/>
+              </w:rPr>
+              <w:t>Recall Fail</w:t>
+            </w:r>
+          </w:p>
+        </w:tc>
+        <w:tc>
+          <w:tcPr>
+            <w:tcW w:w="1650" w:type="dxa"/>
+            <w:vAlign w:val="center"/>
+            <w:shd w:val="clear" w:fill="E7EDF3"/>
+          </w:tcPr>
+          <w:p>
+            <w:pPr>
+              <w:spacing w:before="0" w:after="0" w:line="264" w:lineRule="auto"/>
+              <w:ind w:left="0" w:right="0" w:firstLine="0"/>
+              <w:jc w:val="center"/>
+              <w:keepNext w:val="1"/>
+            </w:pPr>
+            <w:r>
+              <w:rPr>
+                <w:rFonts w:ascii="Times New Roman" w:hAnsi="Times New Roman"/>
+                <w:sz w:val="22"/>
+                <w:szCs w:val="22"/>
+                <w:b w:val="1"/>
+              </w:rPr>
+              <w:t>F1 Fail</w:t>
+            </w:r>
+          </w:p>
+        </w:tc>
+      </w:tr>
+      <w:tr>
+        <w:trPr>
+          <w:cantSplit/>
+        </w:trPr>
+        <w:tc>
+          <w:tcPr>
+            <w:tcW w:w="2760" w:type="dxa"/>
+            <w:vAlign w:val="center"/>
+          </w:tcPr>
+          <w:p>
+            <w:pPr>
+              <w:spacing w:before="0" w:after="0" w:line="264" w:lineRule="auto"/>
+              <w:ind w:left="0" w:right="0" w:firstLine="0"/>
+              <w:jc w:val="left"/>
+              <w:keepNext w:val="1"/>
+            </w:pPr>
+            <w:r>
+              <w:rPr>
+                <w:rFonts w:ascii="Times New Roman" w:hAnsi="Times New Roman"/>
+                <w:sz w:val="22"/>
+                <w:szCs w:val="22"/>
+              </w:rPr>
+              <w:t>Regresión Logística</w:t>
+            </w:r>
+          </w:p>
+        </w:tc>
+        <w:tc>
+          <w:tcPr>
+            <w:tcW w:w="1650" w:type="dxa"/>
+            <w:vAlign w:val="center"/>
+          </w:tcPr>
+          <w:p>
+            <w:pPr>
+              <w:spacing w:before="0" w:after="0" w:line="264" w:lineRule="auto"/>
+              <w:ind w:left="0" w:right="0" w:firstLine="0"/>
+              <w:jc w:val="center"/>
+              <w:keepNext w:val="1"/>
+            </w:pPr>
+            <w:r>
+              <w:rPr>
+                <w:rFonts w:ascii="Times New Roman" w:hAnsi="Times New Roman"/>
+                <w:sz w:val="22"/>
+                <w:szCs w:val="22"/>
+              </w:rPr>
+              <w:t>0,535530</w:t>
+            </w:r>
+          </w:p>
+        </w:tc>
+        <w:tc>
+          <w:tcPr>
+            <w:tcW w:w="1650" w:type="dxa"/>
+            <w:vAlign w:val="center"/>
+          </w:tcPr>
+          <w:p>
+            <w:pPr>
+              <w:spacing w:before="0" w:after="0" w:line="264" w:lineRule="auto"/>
+              <w:ind w:left="0" w:right="0" w:firstLine="0"/>
+              <w:jc w:val="center"/>
+              <w:keepNext w:val="1"/>
+            </w:pPr>
+            <w:r>
+              <w:rPr>
+                <w:rFonts w:ascii="Times New Roman" w:hAnsi="Times New Roman"/>
+                <w:sz w:val="22"/>
+                <w:szCs w:val="22"/>
+              </w:rPr>
+              <w:t>0,228831</w:t>
+            </w:r>
+          </w:p>
+        </w:tc>
+        <w:tc>
+          <w:tcPr>
+            <w:tcW w:w="1650" w:type="dxa"/>
+            <w:vAlign w:val="center"/>
+          </w:tcPr>
+          <w:p>
+            <w:pPr>
+              <w:spacing w:before="0" w:after="0" w:line="264" w:lineRule="auto"/>
+              <w:ind w:left="0" w:right="0" w:firstLine="0"/>
+              <w:jc w:val="center"/>
+              <w:keepNext w:val="1"/>
+            </w:pPr>
+            <w:r>
+              <w:rPr>
+                <w:rFonts w:ascii="Times New Roman" w:hAnsi="Times New Roman"/>
+                <w:sz w:val="22"/>
+                <w:szCs w:val="22"/>
+              </w:rPr>
+              <w:t>0,506045</w:t>
+            </w:r>
+          </w:p>
+        </w:tc>
+        <w:tc>
+          <w:tcPr>
+            <w:tcW w:w="1650" w:type="dxa"/>
+            <w:vAlign w:val="center"/>
+          </w:tcPr>
+          <w:p>
+            <w:pPr>
+              <w:spacing w:before="0" w:after="0" w:line="264" w:lineRule="auto"/>
+              <w:ind w:left="0" w:right="0" w:firstLine="0"/>
+              <w:jc w:val="center"/>
+              <w:keepNext w:val="1"/>
+            </w:pPr>
+            <w:r>
+              <w:rPr>
+                <w:rFonts w:ascii="Times New Roman" w:hAnsi="Times New Roman"/>
+                <w:sz w:val="22"/>
+                <w:szCs w:val="22"/>
+              </w:rPr>
+              <w:t>0,315152</w:t>
+            </w:r>
+          </w:p>
+        </w:tc>
+      </w:tr>
+      <w:tr>
+        <w:trPr>
+          <w:cantSplit/>
+        </w:trPr>
+        <w:tc>
+          <w:tcPr>
+            <w:tcW w:w="2760" w:type="dxa"/>
+            <w:vAlign w:val="center"/>
+          </w:tcPr>
+          <w:p>
+            <w:pPr>
+              <w:spacing w:before="0" w:after="0" w:line="264" w:lineRule="auto"/>
+              <w:ind w:left="0" w:right="0" w:firstLine="0"/>
+              <w:jc w:val="left"/>
+              <w:keepNext w:val="1"/>
+            </w:pPr>
+            <w:r>
+              <w:rPr>
+                <w:rFonts w:ascii="Times New Roman" w:hAnsi="Times New Roman"/>
+                <w:sz w:val="22"/>
+                <w:szCs w:val="22"/>
+              </w:rPr>
+              <w:t>Árbol de Decisión</w:t>
+            </w:r>
+          </w:p>
+        </w:tc>
+        <w:tc>
+          <w:tcPr>
+            <w:tcW w:w="1650" w:type="dxa"/>
+            <w:vAlign w:val="center"/>
+          </w:tcPr>
+          <w:p>
+            <w:pPr>
+              <w:spacing w:before="0" w:after="0" w:line="264" w:lineRule="auto"/>
+              <w:ind w:left="0" w:right="0" w:firstLine="0"/>
+              <w:jc w:val="center"/>
+              <w:keepNext w:val="1"/>
+            </w:pPr>
+            <w:r>
+              <w:rPr>
+                <w:rFonts w:ascii="Times New Roman" w:hAnsi="Times New Roman"/>
+                <w:sz w:val="22"/>
+                <w:szCs w:val="22"/>
+              </w:rPr>
+              <w:t>0,771751</w:t>
+            </w:r>
+          </w:p>
+        </w:tc>
+        <w:tc>
+          <w:tcPr>
+            <w:tcW w:w="1650" w:type="dxa"/>
+            <w:vAlign w:val="center"/>
+          </w:tcPr>
+          <w:p>
+            <w:pPr>
+              <w:spacing w:before="0" w:after="0" w:line="264" w:lineRule="auto"/>
+              <w:ind w:left="0" w:right="0" w:firstLine="0"/>
+              <w:jc w:val="center"/>
+              <w:keepNext w:val="1"/>
+            </w:pPr>
+            <w:r>
+              <w:rPr>
+                <w:rFonts w:ascii="Times New Roman" w:hAnsi="Times New Roman"/>
+                <w:sz w:val="22"/>
+                <w:szCs w:val="22"/>
+              </w:rPr>
+              <w:t>0,256228</w:t>
+            </w:r>
+          </w:p>
+        </w:tc>
+        <w:tc>
+          <w:tcPr>
+            <w:tcW w:w="1650" w:type="dxa"/>
+            <w:vAlign w:val="center"/>
+          </w:tcPr>
+          <w:p>
+            <w:pPr>
+              <w:spacing w:before="0" w:after="0" w:line="264" w:lineRule="auto"/>
+              <w:ind w:left="0" w:right="0" w:firstLine="0"/>
+              <w:jc w:val="center"/>
+              <w:keepNext w:val="1"/>
+            </w:pPr>
+            <w:r>
+              <w:rPr>
+                <w:rFonts w:ascii="Times New Roman" w:hAnsi="Times New Roman"/>
+                <w:sz w:val="22"/>
+                <w:szCs w:val="22"/>
+              </w:rPr>
+              <w:t>0,042465</w:t>
+            </w:r>
+          </w:p>
+        </w:tc>
+        <w:tc>
+          <w:tcPr>
+            <w:tcW w:w="1650" w:type="dxa"/>
+            <w:vAlign w:val="center"/>
+          </w:tcPr>
+          <w:p>
+            <w:pPr>
+              <w:spacing w:before="0" w:after="0" w:line="264" w:lineRule="auto"/>
+              <w:ind w:left="0" w:right="0" w:firstLine="0"/>
+              <w:jc w:val="center"/>
+              <w:keepNext w:val="1"/>
+            </w:pPr>
+            <w:r>
+              <w:rPr>
+                <w:rFonts w:ascii="Times New Roman" w:hAnsi="Times New Roman"/>
+                <w:sz w:val="22"/>
+                <w:szCs w:val="22"/>
+              </w:rPr>
+              <w:t>0,072856</w:t>
+            </w:r>
+          </w:p>
+        </w:tc>
+      </w:tr>
+      <w:tr>
+        <w:trPr>
+          <w:cantSplit/>
+        </w:trPr>
+        <w:tc>
+          <w:tcPr>
+            <w:tcW w:w="2760" w:type="dxa"/>
+            <w:vAlign w:val="center"/>
+          </w:tcPr>
+          <w:p>
+            <w:pPr>
+              <w:spacing w:before="0" w:after="0" w:line="264" w:lineRule="auto"/>
+              <w:ind w:left="0" w:right="0" w:firstLine="0"/>
+              <w:jc w:val="left"/>
+            </w:pPr>
+            <w:r>
+              <w:rPr>
+                <w:rFonts w:ascii="Times New Roman" w:hAnsi="Times New Roman"/>
+                <w:sz w:val="22"/>
+                <w:szCs w:val="22"/>
+              </w:rPr>
+              <w:t>Baseline No Fail</w:t>
+            </w:r>
+          </w:p>
+        </w:tc>
+        <w:tc>
+          <w:tcPr>
+            <w:tcW w:w="1650" w:type="dxa"/>
+            <w:vAlign w:val="center"/>
+          </w:tcPr>
+          <w:p>
+            <w:pPr>
+              <w:spacing w:before="0" w:after="0" w:line="264" w:lineRule="auto"/>
+              <w:ind w:left="0" w:right="0" w:firstLine="0"/>
+              <w:jc w:val="center"/>
+            </w:pPr>
+            <w:r>
+              <w:rPr>
+                <w:rFonts w:ascii="Times New Roman" w:hAnsi="Times New Roman"/>
+                <w:sz w:val="22"/>
+                <w:szCs w:val="22"/>
+              </w:rPr>
+              <w:t>0,788815</w:t>
+            </w:r>
+          </w:p>
+        </w:tc>
+        <w:tc>
+          <w:tcPr>
+            <w:tcW w:w="1650" w:type="dxa"/>
+            <w:vAlign w:val="center"/>
+          </w:tcPr>
+          <w:p>
+            <w:pPr>
+              <w:spacing w:before="0" w:after="0" w:line="264" w:lineRule="auto"/>
+              <w:ind w:left="0" w:right="0" w:firstLine="0"/>
+              <w:jc w:val="center"/>
+            </w:pPr>
+            <w:r>
+              <w:rPr>
+                <w:rFonts w:ascii="Times New Roman" w:hAnsi="Times New Roman"/>
+                <w:sz w:val="22"/>
+                <w:szCs w:val="22"/>
+              </w:rPr>
+              <w:t>0,000000</w:t>
+            </w:r>
+          </w:p>
+        </w:tc>
+        <w:tc>
+          <w:tcPr>
+            <w:tcW w:w="1650" w:type="dxa"/>
+            <w:vAlign w:val="center"/>
+          </w:tcPr>
+          <w:p>
+            <w:pPr>
+              <w:spacing w:before="0" w:after="0" w:line="264" w:lineRule="auto"/>
+              <w:ind w:left="0" w:right="0" w:firstLine="0"/>
+              <w:jc w:val="center"/>
+            </w:pPr>
+            <w:r>
+              <w:rPr>
+                <w:rFonts w:ascii="Times New Roman" w:hAnsi="Times New Roman"/>
+                <w:sz w:val="22"/>
+                <w:szCs w:val="22"/>
+              </w:rPr>
+              <w:t>0,000000</w:t>
+            </w:r>
+          </w:p>
+        </w:tc>
+        <w:tc>
+          <w:tcPr>
+            <w:tcW w:w="1650" w:type="dxa"/>
+            <w:vAlign w:val="center"/>
+          </w:tcPr>
+          <w:p>
+            <w:pPr>
+              <w:spacing w:before="0" w:after="0" w:line="264" w:lineRule="auto"/>
+              <w:ind w:left="0" w:right="0" w:firstLine="0"/>
+              <w:jc w:val="center"/>
+            </w:pPr>
+            <w:r>
+              <w:rPr>
+                <w:rFonts w:ascii="Times New Roman" w:hAnsi="Times New Roman"/>
+                <w:sz w:val="22"/>
+                <w:szCs w:val="22"/>
+              </w:rPr>
+              <w:t>0,000000</w:t>
+            </w:r>
+          </w:p>
+        </w:tc>
+      </w:tr>
+    </w:tbl>
+    <w:p>
+      <w:pPr>
+        <w:spacing w:after="200" w:before="0" w:lineRule="auto" w:line="360"/>
+        <w:ind w:firstLine="720"/>
+        <w:rPr/>
+        <w:jc w:val="both"/>
+        <w:widowControl w:val="1"/>
+        <w:keepNext w:val="1"/>
+      </w:pPr>
+      <w:r>
+        <w:t>Matrices de confusión: Las filas indican el resultado real y las columnas, la predicción. Cada matriz contiene los 16.057 registros de test.</w:t>
+      </w:r>
+    </w:p>
+    <w:tbl>
+      <w:tblPr>
+        <w:tblW w:w="9360" w:type="dxa"/>
+        <w:jc w:val="center"/>
+        <w:tblLayout w:type="fixed"/>
+        <w:tblBorders>
+          <w:top w:val="single" w:sz="4" w:color="D9D9D9"/>
+          <w:left w:val="single" w:sz="4" w:color="D9D9D9"/>
+          <w:bottom w:val="single" w:sz="4" w:color="D9D9D9"/>
+          <w:right w:val="single" w:sz="4" w:color="D9D9D9"/>
+          <w:insideH w:val="single" w:sz="4" w:color="D9D9D9"/>
+          <w:insideV w:val="single" w:sz="4" w:color="D9D9D9"/>
+        </w:tblBorders>
+        <w:tblCellMar>
+          <w:top w:w="75" w:type="dxa"/>
+          <w:bottom w:w="75" w:type="dxa"/>
+          <w:left w:w="100" w:type="dxa"/>
+          <w:right w:w="100" w:type="dxa"/>
+        </w:tblCellMar>
+      </w:tblPr>
+      <w:tblGrid>
+        <w:gridCol w:w="2700"/>
+        <w:gridCol w:w="2100"/>
+        <w:gridCol w:w="2280"/>
+        <w:gridCol w:w="2280"/>
+      </w:tblGrid>
+      <w:tr>
+        <w:trPr>
+          <w:cantSplit/>
+          <w:tblHeader/>
+        </w:trPr>
+        <w:tc>
+          <w:tcPr>
+            <w:tcW w:w="2700" w:type="dxa"/>
+            <w:vAlign w:val="center"/>
+            <w:shd w:val="clear" w:fill="E7EDF3"/>
+          </w:tcPr>
+          <w:p>
+            <w:pPr>
+              <w:spacing w:before="0" w:after="0" w:line="264" w:lineRule="auto"/>
+              <w:ind w:left="0" w:right="0" w:firstLine="0"/>
+              <w:jc w:val="left"/>
+              <w:keepNext w:val="1"/>
+            </w:pPr>
+            <w:r>
+              <w:rPr>
+                <w:rFonts w:ascii="Times New Roman" w:hAnsi="Times New Roman"/>
+                <w:sz w:val="22"/>
+                <w:szCs w:val="22"/>
+                <w:b w:val="1"/>
+              </w:rPr>
+              <w:t>Modelo</w:t>
+            </w:r>
+          </w:p>
+        </w:tc>
+        <w:tc>
+          <w:tcPr>
+            <w:tcW w:w="2100" w:type="dxa"/>
+            <w:vAlign w:val="center"/>
+            <w:shd w:val="clear" w:fill="E7EDF3"/>
+          </w:tcPr>
+          <w:p>
+            <w:pPr>
+              <w:spacing w:before="0" w:after="0" w:line="264" w:lineRule="auto"/>
+              <w:ind w:left="0" w:right="0" w:firstLine="0"/>
+              <w:jc w:val="center"/>
+              <w:keepNext w:val="1"/>
+            </w:pPr>
+            <w:r>
+              <w:rPr>
+                <w:rFonts w:ascii="Times New Roman" w:hAnsi="Times New Roman"/>
+                <w:sz w:val="22"/>
+                <w:szCs w:val="22"/>
+                <w:b w:val="1"/>
+              </w:rPr>
+              <w:t>Resultado real</w:t>
+            </w:r>
+          </w:p>
+        </w:tc>
+        <w:tc>
+          <w:tcPr>
+            <w:tcW w:w="2280" w:type="dxa"/>
+            <w:vAlign w:val="center"/>
+            <w:shd w:val="clear" w:fill="E7EDF3"/>
+          </w:tcPr>
+          <w:p>
+            <w:pPr>
+              <w:spacing w:before="0" w:after="0" w:line="264" w:lineRule="auto"/>
+              <w:ind w:left="0" w:right="0" w:firstLine="0"/>
+              <w:jc w:val="center"/>
+              <w:keepNext w:val="1"/>
+            </w:pPr>
+            <w:r>
+              <w:rPr>
+                <w:rFonts w:ascii="Times New Roman" w:hAnsi="Times New Roman"/>
+                <w:sz w:val="22"/>
+                <w:szCs w:val="22"/>
+                <w:b w:val="1"/>
+              </w:rPr>
+              <w:t>Predicho No Fail</w:t>
+            </w:r>
+          </w:p>
+        </w:tc>
+        <w:tc>
+          <w:tcPr>
+            <w:tcW w:w="2280" w:type="dxa"/>
+            <w:vAlign w:val="center"/>
+            <w:shd w:val="clear" w:fill="E7EDF3"/>
+          </w:tcPr>
+          <w:p>
+            <w:pPr>
+              <w:spacing w:before="0" w:after="0" w:line="264" w:lineRule="auto"/>
+              <w:ind w:left="0" w:right="0" w:firstLine="0"/>
+              <w:jc w:val="center"/>
+              <w:keepNext w:val="1"/>
+            </w:pPr>
+            <w:r>
+              <w:rPr>
+                <w:rFonts w:ascii="Times New Roman" w:hAnsi="Times New Roman"/>
+                <w:sz w:val="22"/>
+                <w:szCs w:val="22"/>
+                <w:b w:val="1"/>
+              </w:rPr>
+              <w:t>Predicho Fail</w:t>
+            </w:r>
+          </w:p>
+        </w:tc>
+      </w:tr>
+      <w:tr>
+        <w:trPr>
+          <w:cantSplit/>
+        </w:trPr>
+        <w:tc>
+          <w:tcPr>
+            <w:tcW w:w="2700" w:type="dxa"/>
+            <w:vAlign w:val="center"/>
+          </w:tcPr>
+          <w:p>
+            <w:pPr>
+              <w:spacing w:before="0" w:after="0" w:line="264" w:lineRule="auto"/>
+              <w:ind w:left="0" w:right="0" w:firstLine="0"/>
+              <w:jc w:val="left"/>
+              <w:keepNext w:val="1"/>
+            </w:pPr>
+            <w:r>
+              <w:rPr>
+                <w:rFonts w:ascii="Times New Roman" w:hAnsi="Times New Roman"/>
+                <w:sz w:val="22"/>
+                <w:szCs w:val="22"/>
+              </w:rPr>
+              <w:t>Regresión Logística</w:t>
+            </w:r>
+          </w:p>
+        </w:tc>
+        <w:tc>
+          <w:tcPr>
+            <w:tcW w:w="2100" w:type="dxa"/>
+            <w:vAlign w:val="center"/>
+          </w:tcPr>
+          <w:p>
+            <w:pPr>
+              <w:spacing w:before="0" w:after="0" w:line="264" w:lineRule="auto"/>
+              <w:ind w:left="0" w:right="0" w:firstLine="0"/>
+              <w:jc w:val="center"/>
+              <w:keepNext w:val="1"/>
+            </w:pPr>
+            <w:r>
+              <w:rPr>
+                <w:rFonts w:ascii="Times New Roman" w:hAnsi="Times New Roman"/>
+                <w:sz w:val="22"/>
+                <w:szCs w:val="22"/>
+              </w:rPr>
+              <w:t>No Fail</w:t>
+            </w:r>
+          </w:p>
+        </w:tc>
+        <w:tc>
+          <w:tcPr>
+            <w:tcW w:w="2280" w:type="dxa"/>
+            <w:vAlign w:val="center"/>
+          </w:tcPr>
+          <w:p>
+            <w:pPr>
+              <w:spacing w:before="0" w:after="0" w:line="264" w:lineRule="auto"/>
+              <w:ind w:left="0" w:right="0" w:firstLine="0"/>
+              <w:jc w:val="center"/>
+              <w:keepNext w:val="1"/>
+            </w:pPr>
+            <w:r>
+              <w:rPr>
+                <w:rFonts w:ascii="Times New Roman" w:hAnsi="Times New Roman"/>
+                <w:sz w:val="22"/>
+                <w:szCs w:val="22"/>
+              </w:rPr>
+              <w:t>6.883</w:t>
+            </w:r>
+          </w:p>
+        </w:tc>
+        <w:tc>
+          <w:tcPr>
+            <w:tcW w:w="2280" w:type="dxa"/>
+            <w:vAlign w:val="center"/>
+          </w:tcPr>
+          <w:p>
+            <w:pPr>
+              <w:spacing w:before="0" w:after="0" w:line="264" w:lineRule="auto"/>
+              <w:ind w:left="0" w:right="0" w:firstLine="0"/>
+              <w:jc w:val="center"/>
+              <w:keepNext w:val="1"/>
+            </w:pPr>
+            <w:r>
+              <w:rPr>
+                <w:rFonts w:ascii="Times New Roman" w:hAnsi="Times New Roman"/>
+                <w:sz w:val="22"/>
+                <w:szCs w:val="22"/>
+              </w:rPr>
+              <w:t>5.783</w:t>
+            </w:r>
+          </w:p>
+        </w:tc>
+      </w:tr>
+      <w:tr>
+        <w:trPr>
+          <w:cantSplit/>
+        </w:trPr>
+        <w:tc>
+          <w:tcPr>
+            <w:tcW w:w="2700" w:type="dxa"/>
+            <w:vAlign w:val="center"/>
+          </w:tcPr>
+          <w:p>
+            <w:pPr>
+              <w:spacing w:before="0" w:after="0" w:line="264" w:lineRule="auto"/>
+              <w:ind w:left="0" w:right="0" w:firstLine="0"/>
+              <w:jc w:val="left"/>
+              <w:keepNext w:val="1"/>
+            </w:pPr>
+            <w:r>
+              <w:rPr>
+                <w:rFonts w:ascii="Times New Roman" w:hAnsi="Times New Roman"/>
+                <w:sz w:val="22"/>
+                <w:szCs w:val="22"/>
+              </w:rPr>
+              <w:t>Regresión Logística</w:t>
+            </w:r>
+          </w:p>
+        </w:tc>
+        <w:tc>
+          <w:tcPr>
+            <w:tcW w:w="2100" w:type="dxa"/>
+            <w:vAlign w:val="center"/>
+          </w:tcPr>
+          <w:p>
+            <w:pPr>
+              <w:spacing w:before="0" w:after="0" w:line="264" w:lineRule="auto"/>
+              <w:ind w:left="0" w:right="0" w:firstLine="0"/>
+              <w:jc w:val="center"/>
+              <w:keepNext w:val="1"/>
+            </w:pPr>
+            <w:r>
+              <w:rPr>
+                <w:rFonts w:ascii="Times New Roman" w:hAnsi="Times New Roman"/>
+                <w:sz w:val="22"/>
+                <w:szCs w:val="22"/>
+              </w:rPr>
+              <w:t>Fail</w:t>
+            </w:r>
+          </w:p>
+        </w:tc>
+        <w:tc>
+          <w:tcPr>
+            <w:tcW w:w="2280" w:type="dxa"/>
+            <w:vAlign w:val="center"/>
+          </w:tcPr>
+          <w:p>
+            <w:pPr>
+              <w:spacing w:before="0" w:after="0" w:line="264" w:lineRule="auto"/>
+              <w:ind w:left="0" w:right="0" w:firstLine="0"/>
+              <w:jc w:val="center"/>
+              <w:keepNext w:val="1"/>
+            </w:pPr>
+            <w:r>
+              <w:rPr>
+                <w:rFonts w:ascii="Times New Roman" w:hAnsi="Times New Roman"/>
+                <w:sz w:val="22"/>
+                <w:szCs w:val="22"/>
+              </w:rPr>
+              <w:t>1.675</w:t>
+            </w:r>
+          </w:p>
+        </w:tc>
+        <w:tc>
+          <w:tcPr>
+            <w:tcW w:w="2280" w:type="dxa"/>
+            <w:vAlign w:val="center"/>
+          </w:tcPr>
+          <w:p>
+            <w:pPr>
+              <w:spacing w:before="0" w:after="0" w:line="264" w:lineRule="auto"/>
+              <w:ind w:left="0" w:right="0" w:firstLine="0"/>
+              <w:jc w:val="center"/>
+              <w:keepNext w:val="1"/>
+            </w:pPr>
+            <w:r>
+              <w:rPr>
+                <w:rFonts w:ascii="Times New Roman" w:hAnsi="Times New Roman"/>
+                <w:sz w:val="22"/>
+                <w:szCs w:val="22"/>
+              </w:rPr>
+              <w:t>1.716</w:t>
+            </w:r>
+          </w:p>
+        </w:tc>
+      </w:tr>
+      <w:tr>
+        <w:trPr>
+          <w:cantSplit/>
+        </w:trPr>
+        <w:tc>
+          <w:tcPr>
+            <w:tcW w:w="2700" w:type="dxa"/>
+            <w:vAlign w:val="center"/>
+          </w:tcPr>
+          <w:p>
+            <w:pPr>
+              <w:spacing w:before="0" w:after="0" w:line="264" w:lineRule="auto"/>
+              <w:ind w:left="0" w:right="0" w:firstLine="0"/>
+              <w:jc w:val="left"/>
+              <w:keepNext w:val="1"/>
+            </w:pPr>
+            <w:r>
+              <w:rPr>
+                <w:rFonts w:ascii="Times New Roman" w:hAnsi="Times New Roman"/>
+                <w:sz w:val="22"/>
+                <w:szCs w:val="22"/>
+              </w:rPr>
+              <w:t>Árbol de Decisión</w:t>
+            </w:r>
+          </w:p>
+        </w:tc>
+        <w:tc>
+          <w:tcPr>
+            <w:tcW w:w="2100" w:type="dxa"/>
+            <w:vAlign w:val="center"/>
+          </w:tcPr>
+          <w:p>
+            <w:pPr>
+              <w:spacing w:before="0" w:after="0" w:line="264" w:lineRule="auto"/>
+              <w:ind w:left="0" w:right="0" w:firstLine="0"/>
+              <w:jc w:val="center"/>
+              <w:keepNext w:val="1"/>
+            </w:pPr>
+            <w:r>
+              <w:rPr>
+                <w:rFonts w:ascii="Times New Roman" w:hAnsi="Times New Roman"/>
+                <w:sz w:val="22"/>
+                <w:szCs w:val="22"/>
+              </w:rPr>
+              <w:t>No Fail</w:t>
+            </w:r>
+          </w:p>
+        </w:tc>
+        <w:tc>
+          <w:tcPr>
+            <w:tcW w:w="2280" w:type="dxa"/>
+            <w:vAlign w:val="center"/>
+          </w:tcPr>
+          <w:p>
+            <w:pPr>
+              <w:spacing w:before="0" w:after="0" w:line="264" w:lineRule="auto"/>
+              <w:ind w:left="0" w:right="0" w:firstLine="0"/>
+              <w:jc w:val="center"/>
+              <w:keepNext w:val="1"/>
+            </w:pPr>
+            <w:r>
+              <w:rPr>
+                <w:rFonts w:ascii="Times New Roman" w:hAnsi="Times New Roman"/>
+                <w:sz w:val="22"/>
+                <w:szCs w:val="22"/>
+              </w:rPr>
+              <w:t>12.248</w:t>
+            </w:r>
+          </w:p>
+        </w:tc>
+        <w:tc>
+          <w:tcPr>
+            <w:tcW w:w="2280" w:type="dxa"/>
+            <w:vAlign w:val="center"/>
+          </w:tcPr>
+          <w:p>
+            <w:pPr>
+              <w:spacing w:before="0" w:after="0" w:line="264" w:lineRule="auto"/>
+              <w:ind w:left="0" w:right="0" w:firstLine="0"/>
+              <w:jc w:val="center"/>
+              <w:keepNext w:val="1"/>
+            </w:pPr>
+            <w:r>
+              <w:rPr>
+                <w:rFonts w:ascii="Times New Roman" w:hAnsi="Times New Roman"/>
+                <w:sz w:val="22"/>
+                <w:szCs w:val="22"/>
+              </w:rPr>
+              <w:t>418</w:t>
+            </w:r>
+          </w:p>
+        </w:tc>
+      </w:tr>
+      <w:tr>
+        <w:trPr>
+          <w:cantSplit/>
+        </w:trPr>
+        <w:tc>
+          <w:tcPr>
+            <w:tcW w:w="2700" w:type="dxa"/>
+            <w:vAlign w:val="center"/>
+          </w:tcPr>
+          <w:p>
+            <w:pPr>
+              <w:spacing w:before="0" w:after="0" w:line="264" w:lineRule="auto"/>
+              <w:ind w:left="0" w:right="0" w:firstLine="0"/>
+              <w:jc w:val="left"/>
+              <w:keepNext w:val="1"/>
+            </w:pPr>
+            <w:r>
+              <w:rPr>
+                <w:rFonts w:ascii="Times New Roman" w:hAnsi="Times New Roman"/>
+                <w:sz w:val="22"/>
+                <w:szCs w:val="22"/>
+              </w:rPr>
+              <w:t>Árbol de Decisión</w:t>
+            </w:r>
+          </w:p>
+        </w:tc>
+        <w:tc>
+          <w:tcPr>
+            <w:tcW w:w="2100" w:type="dxa"/>
+            <w:vAlign w:val="center"/>
+          </w:tcPr>
+          <w:p>
+            <w:pPr>
+              <w:spacing w:before="0" w:after="0" w:line="264" w:lineRule="auto"/>
+              <w:ind w:left="0" w:right="0" w:firstLine="0"/>
+              <w:jc w:val="center"/>
+              <w:keepNext w:val="1"/>
+            </w:pPr>
+            <w:r>
+              <w:rPr>
+                <w:rFonts w:ascii="Times New Roman" w:hAnsi="Times New Roman"/>
+                <w:sz w:val="22"/>
+                <w:szCs w:val="22"/>
+              </w:rPr>
+              <w:t>Fail</w:t>
+            </w:r>
+          </w:p>
+        </w:tc>
+        <w:tc>
+          <w:tcPr>
+            <w:tcW w:w="2280" w:type="dxa"/>
+            <w:vAlign w:val="center"/>
+          </w:tcPr>
+          <w:p>
+            <w:pPr>
+              <w:spacing w:before="0" w:after="0" w:line="264" w:lineRule="auto"/>
+              <w:ind w:left="0" w:right="0" w:firstLine="0"/>
+              <w:jc w:val="center"/>
+              <w:keepNext w:val="1"/>
+            </w:pPr>
+            <w:r>
+              <w:rPr>
+                <w:rFonts w:ascii="Times New Roman" w:hAnsi="Times New Roman"/>
+                <w:sz w:val="22"/>
+                <w:szCs w:val="22"/>
+              </w:rPr>
+              <w:t>3.247</w:t>
+            </w:r>
+          </w:p>
+        </w:tc>
+        <w:tc>
+          <w:tcPr>
+            <w:tcW w:w="2280" w:type="dxa"/>
+            <w:vAlign w:val="center"/>
+          </w:tcPr>
+          <w:p>
+            <w:pPr>
+              <w:spacing w:before="0" w:after="0" w:line="264" w:lineRule="auto"/>
+              <w:ind w:left="0" w:right="0" w:firstLine="0"/>
+              <w:jc w:val="center"/>
+              <w:keepNext w:val="1"/>
+            </w:pPr>
+            <w:r>
+              <w:rPr>
+                <w:rFonts w:ascii="Times New Roman" w:hAnsi="Times New Roman"/>
+                <w:sz w:val="22"/>
+                <w:szCs w:val="22"/>
+              </w:rPr>
+              <w:t>144</w:t>
+            </w:r>
+          </w:p>
+        </w:tc>
+      </w:tr>
+      <w:tr>
+        <w:trPr>
+          <w:cantSplit/>
+        </w:trPr>
+        <w:tc>
+          <w:tcPr>
+            <w:tcW w:w="2700" w:type="dxa"/>
+            <w:vAlign w:val="center"/>
+          </w:tcPr>
+          <w:p>
+            <w:pPr>
+              <w:spacing w:before="0" w:after="0" w:line="264" w:lineRule="auto"/>
+              <w:ind w:left="0" w:right="0" w:firstLine="0"/>
+              <w:jc w:val="left"/>
+              <w:keepNext w:val="1"/>
+            </w:pPr>
+            <w:r>
+              <w:rPr>
+                <w:rFonts w:ascii="Times New Roman" w:hAnsi="Times New Roman"/>
+                <w:sz w:val="22"/>
+                <w:szCs w:val="22"/>
+              </w:rPr>
+              <w:t>Baseline No Fail</w:t>
+            </w:r>
+          </w:p>
+        </w:tc>
+        <w:tc>
+          <w:tcPr>
+            <w:tcW w:w="2100" w:type="dxa"/>
+            <w:vAlign w:val="center"/>
+          </w:tcPr>
+          <w:p>
+            <w:pPr>
+              <w:spacing w:before="0" w:after="0" w:line="264" w:lineRule="auto"/>
+              <w:ind w:left="0" w:right="0" w:firstLine="0"/>
+              <w:jc w:val="center"/>
+              <w:keepNext w:val="1"/>
+            </w:pPr>
+            <w:r>
+              <w:rPr>
+                <w:rFonts w:ascii="Times New Roman" w:hAnsi="Times New Roman"/>
+                <w:sz w:val="22"/>
+                <w:szCs w:val="22"/>
+              </w:rPr>
+              <w:t>No Fail</w:t>
+            </w:r>
+          </w:p>
+        </w:tc>
+        <w:tc>
+          <w:tcPr>
+            <w:tcW w:w="2280" w:type="dxa"/>
+            <w:vAlign w:val="center"/>
+          </w:tcPr>
+          <w:p>
+            <w:pPr>
+              <w:spacing w:before="0" w:after="0" w:line="264" w:lineRule="auto"/>
+              <w:ind w:left="0" w:right="0" w:firstLine="0"/>
+              <w:jc w:val="center"/>
+              <w:keepNext w:val="1"/>
+            </w:pPr>
+            <w:r>
+              <w:rPr>
+                <w:rFonts w:ascii="Times New Roman" w:hAnsi="Times New Roman"/>
+                <w:sz w:val="22"/>
+                <w:szCs w:val="22"/>
+              </w:rPr>
+              <w:t>12.666</w:t>
+            </w:r>
+          </w:p>
+        </w:tc>
+        <w:tc>
+          <w:tcPr>
+            <w:tcW w:w="2280" w:type="dxa"/>
+            <w:vAlign w:val="center"/>
+          </w:tcPr>
+          <w:p>
+            <w:pPr>
+              <w:spacing w:before="0" w:after="0" w:line="264" w:lineRule="auto"/>
+              <w:ind w:left="0" w:right="0" w:firstLine="0"/>
+              <w:jc w:val="center"/>
+              <w:keepNext w:val="1"/>
+            </w:pPr>
+            <w:r>
+              <w:rPr>
+                <w:rFonts w:ascii="Times New Roman" w:hAnsi="Times New Roman"/>
+                <w:sz w:val="22"/>
+                <w:szCs w:val="22"/>
+              </w:rPr>
+              <w:t>0</w:t>
+            </w:r>
+          </w:p>
+        </w:tc>
+      </w:tr>
+      <w:tr>
+        <w:trPr>
+          <w:cantSplit/>
+        </w:trPr>
+        <w:tc>
+          <w:tcPr>
+            <w:tcW w:w="2700" w:type="dxa"/>
+            <w:vAlign w:val="center"/>
+          </w:tcPr>
+          <w:p>
+            <w:pPr>
+              <w:spacing w:before="0" w:after="0" w:line="264" w:lineRule="auto"/>
+              <w:ind w:left="0" w:right="0" w:firstLine="0"/>
+              <w:jc w:val="left"/>
+            </w:pPr>
+            <w:r>
+              <w:rPr>
+                <w:rFonts w:ascii="Times New Roman" w:hAnsi="Times New Roman"/>
+                <w:sz w:val="22"/>
+                <w:szCs w:val="22"/>
+              </w:rPr>
+              <w:t>Baseline No Fail</w:t>
+            </w:r>
+          </w:p>
+        </w:tc>
+        <w:tc>
+          <w:tcPr>
+            <w:tcW w:w="2100" w:type="dxa"/>
+            <w:vAlign w:val="center"/>
+          </w:tcPr>
+          <w:p>
+            <w:pPr>
+              <w:spacing w:before="0" w:after="0" w:line="264" w:lineRule="auto"/>
+              <w:ind w:left="0" w:right="0" w:firstLine="0"/>
+              <w:jc w:val="center"/>
+            </w:pPr>
+            <w:r>
+              <w:rPr>
+                <w:rFonts w:ascii="Times New Roman" w:hAnsi="Times New Roman"/>
+                <w:sz w:val="22"/>
+                <w:szCs w:val="22"/>
+              </w:rPr>
+              <w:t>Fail</w:t>
+            </w:r>
+          </w:p>
+        </w:tc>
+        <w:tc>
+          <w:tcPr>
+            <w:tcW w:w="2280" w:type="dxa"/>
+            <w:vAlign w:val="center"/>
+          </w:tcPr>
+          <w:p>
+            <w:pPr>
+              <w:spacing w:before="0" w:after="0" w:line="264" w:lineRule="auto"/>
+              <w:ind w:left="0" w:right="0" w:firstLine="0"/>
+              <w:jc w:val="center"/>
+            </w:pPr>
+            <w:r>
+              <w:rPr>
+                <w:rFonts w:ascii="Times New Roman" w:hAnsi="Times New Roman"/>
+                <w:sz w:val="22"/>
+                <w:szCs w:val="22"/>
+              </w:rPr>
+              <w:t>3.391</w:t>
+            </w:r>
+          </w:p>
+        </w:tc>
+        <w:tc>
+          <w:tcPr>
+            <w:tcW w:w="2280" w:type="dxa"/>
+            <w:vAlign w:val="center"/>
+          </w:tcPr>
+          <w:p>
+            <w:pPr>
+              <w:spacing w:before="0" w:after="0" w:line="264" w:lineRule="auto"/>
+              <w:ind w:left="0" w:right="0" w:firstLine="0"/>
+              <w:jc w:val="center"/>
+            </w:pPr>
+            <w:r>
+              <w:rPr>
+                <w:rFonts w:ascii="Times New Roman" w:hAnsi="Times New Roman"/>
+                <w:sz w:val="22"/>
+                <w:szCs w:val="22"/>
+              </w:rPr>
+              <w:t>0</w:t>
+            </w:r>
+          </w:p>
+        </w:tc>
+      </w:tr>
+    </w:tbl>
+    <w:p>
+      <w:pPr>
+        <w:spacing w:after="200" w:before="0" w:lineRule="auto" w:line="360"/>
+        <w:ind w:firstLine="720"/>
+        <w:rPr/>
+        <w:jc w:val="both"/>
+        <w:widowControl w:val="1"/>
+      </w:pPr>
+      <w:r>
+        <w:t>Interpretación: Se eligió Regresión Logística como modelo principal por su mayor recall (50,60 %) y F1 para Fail (0,315152): detectó 1.716 Fail, frente a 144 del árbol. Accuracy sola resulta insuficiente: el baseline obtuvo 78,88 %, pero no detectó ningún Fail. Los pesos balanceados favorecen la atención a Fail y pueden reducir accuracy.</w:t>
+      </w:r>
+    </w:p>
+    <w:p>
+      <w:pPr>
+        <w:spacing w:after="200" w:before="0" w:lineRule="auto" w:line="360"/>
+        <w:ind w:firstLine="720"/>
+        <w:rPr/>
+        <w:jc w:val="both"/>
+        <w:widowControl w:val="1"/>
+      </w:pPr>
+      <w:r>
+        <w:t>Limitaciones: La precisión de la Regresión Logística fue baja (22,88 %) y produjo 5.783 falsos positivos. Un establecimiento puede aparecer varias veces, incluso en ambos periodos; la evaluación no corresponde exclusivamente a locales nuevos. Hay categorías raras y nuevas, y se asume que los atributos estaban disponibles antes del resultado, pues CLEAN no conserva su historial. Son asociaciones predictivas, no causales. Los resultados no justifican uso operativo.</w:t>
       </w:r>
     </w:p>
     <w:p>

</xml_diff>

<commit_message>
Se agrego secciones finales al documento investigacion
</commit_message>
<xml_diff>
--- a/documento/Investigacion (1).docx
+++ b/documento/Investigacion (1).docx
@@ -10135,10 +10135,7 @@
         <w:widowControl w:val="1"/>
       </w:pPr>
       <w:r>
-        <w:rPr>
-          <w:rtl w:val="0"/>
-        </w:rPr>
-        <w:t xml:space="preserve">En este apartado se busca dejar claro el proceso llevado a cabo por las tres disciplinas desde sus respectivas áreas de trabajo. Data Engineering recibe el archivo original, lo almacena en Oracle, analiza su calidad, realiza las transformaciones necesarias y produce datos preparados.</w:t>
+        <w:t>El CSV original se conservó sin editar y se cargó en FOOD_INSPECTIONS_RAW. El perfilado entregó controles de registros, IDs, fechas, NULL, categorías, coordenadas y VIOLATIONS; permitió definir la limpieza sin modificar RAW.</w:t>
       </w:r>
     </w:p>
     <w:p>
@@ -10150,15 +10147,19 @@
         <w:widowControl w:val="1"/>
       </w:pPr>
       <w:r>
-        <w:rPr>
-          <w:rtl w:val="0"/>
-        </w:rPr>
-        <w:t xml:space="preserve">Posteriormente, Data Analytics recibe estos datos y los utiliza para realizar consultas, calcular indicadores, identificar tendencias y obtener hallazgos. Finalmente, Data Science recibe los datos preparados y el conocimiento obtenido durante el análisis para desarrollar y evaluar un modelo o técnica estadística. </w:t>
-      </w:r>
-      <w:r>
-        <w:rPr>
-          <w:rtl w:val="0"/>
-        </w:rPr>
+        <w:t>La limpieza y transformación generó FOOD_INSPECTIONS_CLEAN con 316.961 registros y 17 columnas, sin eliminar filas. Se normalizaron FACILITY_TYPE e INSPECTION_TYPE, se aplicó TRIM a ADDRESS y se convirtieron las coordenadas a NUMBER. CLEAN entregó a Data Analytics una fuente validada; sus consultas produjeron indicadores y asociaciones descriptivas, como 61.038 Fail (19,26 % de todos los registros).</w:t>
+      </w:r>
+    </w:p>
+    <w:p>
+      <w:pPr>
+        <w:ind w:firstLine="720"/>
+        <w:rPr/>
+        <w:jc w:val="both"/>
+        <w:spacing w:line="360" w:lineRule="auto"/>
+        <w:widowControl w:val="1"/>
+      </w:pPr>
+      <w:r>
+        <w:t>A partir de CLEAN, FOOD_INSPECTIONS_SCIENCE preparó 103.596 registros para predecir Fail, con los filtros y predictores aprobados. Analytics aportó contexto para definir el problema; sus porcentajes no se usaron como predictores. Data Science recibió la vista, entrenó con 2019–2024 y evaluó con 2025. Entregó métricas y matrices de confusión: Regresión Logística fue el modelo principal por recall y F1, aunque los resultados no justifican uso operativo.</w:t>
       </w:r>
     </w:p>
     <w:p>
@@ -10188,7 +10189,55 @@
     </w:p>
     <w:p>
       <w:pPr>
-        <w:spacing w:after="200" w:before="0" w:lineRule="auto" w:line="360"/>
+        <w:ind w:firstLine="720"/>
+        <w:rPr/>
+        <w:jc w:val="both"/>
+        <w:spacing w:line="360" w:lineRule="auto"/>
+        <w:widowControl w:val="1"/>
+      </w:pPr>
+      <w:r>
+        <w:t>Si RAW interpretara mal las fechas MM/DD/YYYY, las fechas incorrectas llegarían a CLEAN y podrían cambiar la agrupación por año y la separación train/test. El proyecto comprobó el formato y contrastó fechas de muestra con el CSV.</w:t>
+      </w:r>
+    </w:p>
+    <w:p>
+      <w:pPr>
+        <w:ind w:firstLine="720"/>
+        <w:rPr/>
+        <w:jc w:val="both"/>
+        <w:spacing w:line="360" w:lineRule="auto"/>
+        <w:widowControl w:val="1"/>
+      </w:pPr>
+      <w:r>
+        <w:t>Si la limpieza eliminara registros de los 104 grupos candidatos como duplicados confirmados, quitaría inspecciones sin justificación y alteraría conteos y proporciones. Se conservaron todas las filas porque esos grupos no demostraban duplicados exactos.</w:t>
+      </w:r>
+    </w:p>
+    <w:p>
+      <w:pPr>
+        <w:ind w:firstLine="720"/>
+        <w:rPr/>
+        <w:jc w:val="both"/>
+        <w:spacing w:line="360" w:lineRule="auto"/>
+        <w:widowControl w:val="1"/>
+      </w:pPr>
+      <w:r>
+        <w:t>Si Analytics presentara el 19,26 % como porcentaje calculado solo entre Pass y Fail, usaría un denominador distinto del verificado, que incluye siete RESULTS. Confundir asociaciones con causas también llevaría a conclusiones no sustentadas.</w:t>
+      </w:r>
+    </w:p>
+    <w:p>
+      <w:pPr>
+        <w:ind w:firstLine="720"/>
+        <w:rPr/>
+        <w:jc w:val="both"/>
+        <w:spacing w:line="360" w:lineRule="auto"/>
+        <w:widowControl w:val="1"/>
+      </w:pPr>
+      <w:r>
+        <w:t>Si Science usara VIOLATIONS o RESULTS como predictor, incorporaría información conocida durante o después de la inspección. El rendimiento podría parecer mejor sin anticipar el resultado; RESULTS se usó solo para construir el target.</w:t>
+      </w:r>
+    </w:p>
+    <w:p>
+      <w:pPr>
+        <w:spacing w:after="120" w:before="240" w:lineRule="auto" w:line="360"/>
         <w:rPr>
           <w:b w:val="1"/>
           <w:bCs w:val="1"/>
@@ -10197,6 +10246,8 @@
         </w:rPr>
         <w:ind w:left="0" w:right="0" w:firstLine="0"/>
         <w:jc w:val="left"/>
+        <w:keepNext w:val="1"/>
+        <w:keepLines w:val="1"/>
       </w:pPr>
       <w:r>
         <w:rPr>
@@ -10206,55 +10257,19 @@
           <w:iCs w:val="1"/>
           <w:rtl w:val="0"/>
         </w:rPr>
-        <w:t xml:space="preserve">[Pendiente después de realizar las tres etapas.]</w:t>
-      </w:r>
-    </w:p>
-    <w:p>
-      <w:pPr>
-        <w:spacing w:after="120" w:before="240" w:lineRule="auto" w:line="360"/>
-        <w:rPr>
-          <w:b w:val="1"/>
-          <w:bCs w:val="1"/>
-          <w:i w:val="1"/>
-          <w:iCs w:val="1"/>
-        </w:rPr>
-        <w:ind w:left="0" w:right="0" w:firstLine="0"/>
-        <w:jc w:val="left"/>
-        <w:keepNext w:val="1"/>
-        <w:keepLines w:val="1"/>
-      </w:pPr>
-      <w:r>
-        <w:rPr>
-          <w:b w:val="1"/>
-          <w:bCs w:val="1"/>
-          <w:i w:val="1"/>
-          <w:iCs w:val="1"/>
-          <w:rtl w:val="0"/>
-        </w:rPr>
         <w:t xml:space="preserve">Importancia de la base de datos</w:t>
       </w:r>
     </w:p>
     <w:p>
       <w:pPr>
-        <w:spacing w:after="200" w:before="0" w:lineRule="auto" w:line="360"/>
-        <w:rPr>
-          <w:b w:val="1"/>
-          <w:bCs w:val="1"/>
-          <w:i w:val="1"/>
-          <w:iCs w:val="1"/>
-        </w:rPr>
-        <w:ind w:left="0" w:right="0" w:firstLine="0"/>
-        <w:jc w:val="left"/>
-      </w:pPr>
-      <w:r>
-        <w:rPr>
-          <w:b w:val="1"/>
-          <w:bCs w:val="1"/>
-          <w:i w:val="1"/>
-          <w:iCs w:val="1"/>
-          <w:rtl w:val="0"/>
-        </w:rPr>
-        <w:t xml:space="preserve">[Pendiente después de finalizar el caso.]</w:t>
+        <w:ind w:firstLine="720"/>
+        <w:rPr/>
+        <w:jc w:val="both"/>
+        <w:spacing w:line="360" w:lineRule="auto"/>
+        <w:widowControl w:val="1"/>
+      </w:pPr>
+      <w:r>
+        <w:t>Oracle permitió conservar RAW como referencia, crear CLEAN mediante reglas SQL y consultar y validar los 316.961 registros. Las comparaciones RAW/CLEAN, los scripts y las salidas guardadas aportan trazabilidad de las transformaciones. Analytics consultó CLEAN y Science recibió una vista de solo lectura sobre esa misma fuente, sin duplicarla ni modificarla; así, los datos preparados y los filtros del experimento pueden revisarse y reproducirse.</w:t>
       </w:r>
     </w:p>
     <w:p>

</xml_diff>